<commit_message>
fix: cap nhat url backend moi cua Render
</commit_message>
<xml_diff>
--- a/artifacts/Bao_cao_StellarMind_Nguyen_Tan_Phat_25AS037_CAP_NHAT.docx
+++ b/artifacts/Bao_cao_StellarMind_Nguyen_Tan_Phat_25AS037_CAP_NHAT.docx
@@ -12,7 +12,7 @@
           <w:noProof/>
         </w:rPr>
         <w:drawing>
-          <wp:inline distT="0" distB="0" distL="0" distR="0" wp14:anchorId="7D6CFC8E" wp14:editId="5921CDCB">
+          <wp:inline distT="0" distB="0" distL="0" distR="0" wp14:anchorId="036FA020" wp14:editId="6C5EA637">
             <wp:extent cx="5669280" cy="584926"/>
             <wp:effectExtent l="0" t="0" r="0" b="0"/>
             <wp:docPr id="1" name="Picture 1" descr="Biểu trưng Trường Đại học Công nghệ Thông tin và Truyền thông Việt - Hàn" title="Biểu trưng VKU"/>
@@ -354,7 +354,7 @@
           <w:noProof/>
         </w:rPr>
         <w:drawing>
-          <wp:inline distT="0" distB="0" distL="0" distR="0" wp14:anchorId="00E0C87B" wp14:editId="4A77C118">
+          <wp:inline distT="0" distB="0" distL="0" distR="0" wp14:anchorId="061B8DD6" wp14:editId="6A1CF5F9">
             <wp:extent cx="5669280" cy="584926"/>
             <wp:effectExtent l="0" t="0" r="0" b="0"/>
             <wp:docPr id="2" name="Picture 2" descr="Biểu trưng Trường Đại học Công nghệ Thông tin và Truyền thông Việt - Hàn" title="Biểu trưng VKU"/>
@@ -689,7 +689,7 @@
       <w:pPr>
         <w:pStyle w:val="Heading1"/>
       </w:pPr>
-      <w:bookmarkStart w:id="0" w:name="_Toc232195932"/>
+      <w:bookmarkStart w:id="0" w:name="_Toc232196078"/>
       <w:r>
         <w:rPr>
           <w:rFonts w:ascii="Times New Roman" w:eastAsia="Times New Roman" w:hAnsi="Times New Roman"/>
@@ -994,7 +994,7 @@
       <w:pPr>
         <w:pStyle w:val="Heading1"/>
       </w:pPr>
-      <w:bookmarkStart w:id="1" w:name="_Toc232195933"/>
+      <w:bookmarkStart w:id="1" w:name="_Toc232196079"/>
       <w:r>
         <w:rPr>
           <w:rFonts w:ascii="Times New Roman" w:eastAsia="Times New Roman" w:hAnsi="Times New Roman"/>
@@ -1053,7 +1053,7 @@
       <w:pPr>
         <w:pStyle w:val="Heading1"/>
       </w:pPr>
-      <w:bookmarkStart w:id="2" w:name="_Toc232195934"/>
+      <w:bookmarkStart w:id="2" w:name="_Toc232196080"/>
       <w:r>
         <w:rPr>
           <w:rFonts w:ascii="Times New Roman" w:eastAsia="Times New Roman" w:hAnsi="Times New Roman"/>
@@ -1086,7 +1086,7 @@
       <w:r>
         <w:fldChar w:fldCharType="separate"/>
       </w:r>
-      <w:hyperlink w:anchor="_Toc232195932" w:history="1">
+      <w:hyperlink w:anchor="_Toc232196078" w:history="1">
         <w:r>
           <w:rPr>
             <w:rStyle w:val="Hyperlink"/>
@@ -1113,7 +1113,7 @@
             <w:noProof/>
             <w:webHidden/>
           </w:rPr>
-          <w:instrText xml:space="preserve"> PAGEREF _Toc232195932 \h </w:instrText>
+          <w:instrText xml:space="preserve"> PAGEREF _Toc232196078 \h </w:instrText>
         </w:r>
         <w:r>
           <w:rPr>
@@ -1159,7 +1159,7 @@
           <w14:ligatures w14:val="standardContextual"/>
         </w:rPr>
       </w:pPr>
-      <w:hyperlink w:anchor="_Toc232195933" w:history="1">
+      <w:hyperlink w:anchor="_Toc232196079" w:history="1">
         <w:r>
           <w:rPr>
             <w:rStyle w:val="Hyperlink"/>
@@ -1186,7 +1186,7 @@
             <w:noProof/>
             <w:webHidden/>
           </w:rPr>
-          <w:instrText xml:space="preserve"> PAGEREF _Toc232195933 \h </w:instrText>
+          <w:instrText xml:space="preserve"> PAGEREF _Toc232196079 \h </w:instrText>
         </w:r>
         <w:r>
           <w:rPr>
@@ -1232,7 +1232,7 @@
           <w14:ligatures w14:val="standardContextual"/>
         </w:rPr>
       </w:pPr>
-      <w:hyperlink w:anchor="_Toc232195934" w:history="1">
+      <w:hyperlink w:anchor="_Toc232196080" w:history="1">
         <w:r>
           <w:rPr>
             <w:rStyle w:val="Hyperlink"/>
@@ -1259,7 +1259,7 @@
             <w:noProof/>
             <w:webHidden/>
           </w:rPr>
-          <w:instrText xml:space="preserve"> PAGEREF _Toc232195934 \h </w:instrText>
+          <w:instrText xml:space="preserve"> PAGEREF _Toc232196080 \h </w:instrText>
         </w:r>
         <w:r>
           <w:rPr>
@@ -1305,7 +1305,7 @@
           <w14:ligatures w14:val="standardContextual"/>
         </w:rPr>
       </w:pPr>
-      <w:hyperlink w:anchor="_Toc232195935" w:history="1">
+      <w:hyperlink w:anchor="_Toc232196081" w:history="1">
         <w:r>
           <w:rPr>
             <w:rStyle w:val="Hyperlink"/>
@@ -1332,7 +1332,7 @@
             <w:noProof/>
             <w:webHidden/>
           </w:rPr>
-          <w:instrText xml:space="preserve"> PAGEREF _Toc232195935 \h </w:instrText>
+          <w:instrText xml:space="preserve"> PAGEREF _Toc232196081 \h </w:instrText>
         </w:r>
         <w:r>
           <w:rPr>
@@ -1378,7 +1378,7 @@
           <w14:ligatures w14:val="standardContextual"/>
         </w:rPr>
       </w:pPr>
-      <w:hyperlink w:anchor="_Toc232195936" w:history="1">
+      <w:hyperlink w:anchor="_Toc232196082" w:history="1">
         <w:r>
           <w:rPr>
             <w:rStyle w:val="Hyperlink"/>
@@ -1405,7 +1405,7 @@
             <w:noProof/>
             <w:webHidden/>
           </w:rPr>
-          <w:instrText xml:space="preserve"> PAGEREF _Toc232195936 \h </w:instrText>
+          <w:instrText xml:space="preserve"> PAGEREF _Toc232196082 \h </w:instrText>
         </w:r>
         <w:r>
           <w:rPr>
@@ -1451,7 +1451,7 @@
           <w14:ligatures w14:val="standardContextual"/>
         </w:rPr>
       </w:pPr>
-      <w:hyperlink w:anchor="_Toc232195937" w:history="1">
+      <w:hyperlink w:anchor="_Toc232196083" w:history="1">
         <w:r>
           <w:rPr>
             <w:rStyle w:val="Hyperlink"/>
@@ -1478,7 +1478,7 @@
             <w:noProof/>
             <w:webHidden/>
           </w:rPr>
-          <w:instrText xml:space="preserve"> PAGEREF _Toc232195937 \h </w:instrText>
+          <w:instrText xml:space="preserve"> PAGEREF _Toc232196083 \h </w:instrText>
         </w:r>
         <w:r>
           <w:rPr>
@@ -1524,7 +1524,7 @@
           <w14:ligatures w14:val="standardContextual"/>
         </w:rPr>
       </w:pPr>
-      <w:hyperlink w:anchor="_Toc232195938" w:history="1">
+      <w:hyperlink w:anchor="_Toc232196084" w:history="1">
         <w:r>
           <w:rPr>
             <w:rStyle w:val="Hyperlink"/>
@@ -1551,7 +1551,7 @@
             <w:noProof/>
             <w:webHidden/>
           </w:rPr>
-          <w:instrText xml:space="preserve"> PAGEREF _Toc232195938 \h </w:instrText>
+          <w:instrText xml:space="preserve"> PAGEREF _Toc232196084 \h </w:instrText>
         </w:r>
         <w:r>
           <w:rPr>
@@ -1597,7 +1597,7 @@
           <w14:ligatures w14:val="standardContextual"/>
         </w:rPr>
       </w:pPr>
-      <w:hyperlink w:anchor="_Toc232195939" w:history="1">
+      <w:hyperlink w:anchor="_Toc232196085" w:history="1">
         <w:r>
           <w:rPr>
             <w:rStyle w:val="Hyperlink"/>
@@ -1624,7 +1624,7 @@
             <w:noProof/>
             <w:webHidden/>
           </w:rPr>
-          <w:instrText xml:space="preserve"> PAGEREF _Toc232195939 \h </w:instrText>
+          <w:instrText xml:space="preserve"> PAGEREF _Toc232196085 \h </w:instrText>
         </w:r>
         <w:r>
           <w:rPr>
@@ -1670,7 +1670,7 @@
           <w14:ligatures w14:val="standardContextual"/>
         </w:rPr>
       </w:pPr>
-      <w:hyperlink w:anchor="_Toc232195940" w:history="1">
+      <w:hyperlink w:anchor="_Toc232196086" w:history="1">
         <w:r>
           <w:rPr>
             <w:rStyle w:val="Hyperlink"/>
@@ -1697,7 +1697,7 @@
             <w:noProof/>
             <w:webHidden/>
           </w:rPr>
-          <w:instrText xml:space="preserve"> PAGEREF _Toc232195940 \h </w:instrText>
+          <w:instrText xml:space="preserve"> PAGEREF _Toc232196086 \h </w:instrText>
         </w:r>
         <w:r>
           <w:rPr>
@@ -1743,7 +1743,7 @@
           <w14:ligatures w14:val="standardContextual"/>
         </w:rPr>
       </w:pPr>
-      <w:hyperlink w:anchor="_Toc232195941" w:history="1">
+      <w:hyperlink w:anchor="_Toc232196087" w:history="1">
         <w:r>
           <w:rPr>
             <w:rStyle w:val="Hyperlink"/>
@@ -1770,7 +1770,7 @@
             <w:noProof/>
             <w:webHidden/>
           </w:rPr>
-          <w:instrText xml:space="preserve"> PAGEREF _Toc232195941 \h </w:instrText>
+          <w:instrText xml:space="preserve"> PAGEREF _Toc232196087 \h </w:instrText>
         </w:r>
         <w:r>
           <w:rPr>
@@ -1816,7 +1816,7 @@
           <w14:ligatures w14:val="standardContextual"/>
         </w:rPr>
       </w:pPr>
-      <w:hyperlink w:anchor="_Toc232195942" w:history="1">
+      <w:hyperlink w:anchor="_Toc232196088" w:history="1">
         <w:r>
           <w:rPr>
             <w:rStyle w:val="Hyperlink"/>
@@ -1843,7 +1843,7 @@
             <w:noProof/>
             <w:webHidden/>
           </w:rPr>
-          <w:instrText xml:space="preserve"> PAGEREF _Toc232195942 \h </w:instrText>
+          <w:instrText xml:space="preserve"> PAGEREF _Toc232196088 \h </w:instrText>
         </w:r>
         <w:r>
           <w:rPr>
@@ -1889,7 +1889,7 @@
           <w14:ligatures w14:val="standardContextual"/>
         </w:rPr>
       </w:pPr>
-      <w:hyperlink w:anchor="_Toc232195943" w:history="1">
+      <w:hyperlink w:anchor="_Toc232196089" w:history="1">
         <w:r>
           <w:rPr>
             <w:rStyle w:val="Hyperlink"/>
@@ -1916,7 +1916,7 @@
             <w:noProof/>
             <w:webHidden/>
           </w:rPr>
-          <w:instrText xml:space="preserve"> PAGEREF _Toc232195943 \h </w:instrText>
+          <w:instrText xml:space="preserve"> PAGEREF _Toc232196089 \h </w:instrText>
         </w:r>
         <w:r>
           <w:rPr>
@@ -1962,7 +1962,7 @@
           <w14:ligatures w14:val="standardContextual"/>
         </w:rPr>
       </w:pPr>
-      <w:hyperlink w:anchor="_Toc232195944" w:history="1">
+      <w:hyperlink w:anchor="_Toc232196090" w:history="1">
         <w:r>
           <w:rPr>
             <w:rStyle w:val="Hyperlink"/>
@@ -1989,7 +1989,7 @@
             <w:noProof/>
             <w:webHidden/>
           </w:rPr>
-          <w:instrText xml:space="preserve"> PAGEREF _Toc232195944 \h </w:instrText>
+          <w:instrText xml:space="preserve"> PAGEREF _Toc232196090 \h </w:instrText>
         </w:r>
         <w:r>
           <w:rPr>
@@ -2035,7 +2035,7 @@
           <w14:ligatures w14:val="standardContextual"/>
         </w:rPr>
       </w:pPr>
-      <w:hyperlink w:anchor="_Toc232195945" w:history="1">
+      <w:hyperlink w:anchor="_Toc232196091" w:history="1">
         <w:r>
           <w:rPr>
             <w:rStyle w:val="Hyperlink"/>
@@ -2062,7 +2062,7 @@
             <w:noProof/>
             <w:webHidden/>
           </w:rPr>
-          <w:instrText xml:space="preserve"> PAGEREF _Toc232195945 \h </w:instrText>
+          <w:instrText xml:space="preserve"> PAGEREF _Toc232196091 \h </w:instrText>
         </w:r>
         <w:r>
           <w:rPr>
@@ -2108,7 +2108,7 @@
           <w14:ligatures w14:val="standardContextual"/>
         </w:rPr>
       </w:pPr>
-      <w:hyperlink w:anchor="_Toc232195946" w:history="1">
+      <w:hyperlink w:anchor="_Toc232196092" w:history="1">
         <w:r>
           <w:rPr>
             <w:rStyle w:val="Hyperlink"/>
@@ -2135,7 +2135,7 @@
             <w:noProof/>
             <w:webHidden/>
           </w:rPr>
-          <w:instrText xml:space="preserve"> PAGEREF _Toc232195946 \h </w:instrText>
+          <w:instrText xml:space="preserve"> PAGEREF _Toc232196092 \h </w:instrText>
         </w:r>
         <w:r>
           <w:rPr>
@@ -2181,7 +2181,7 @@
           <w14:ligatures w14:val="standardContextual"/>
         </w:rPr>
       </w:pPr>
-      <w:hyperlink w:anchor="_Toc232195947" w:history="1">
+      <w:hyperlink w:anchor="_Toc232196093" w:history="1">
         <w:r>
           <w:rPr>
             <w:rStyle w:val="Hyperlink"/>
@@ -2208,7 +2208,7 @@
             <w:noProof/>
             <w:webHidden/>
           </w:rPr>
-          <w:instrText xml:space="preserve"> PAGEREF _Toc232195947 \h </w:instrText>
+          <w:instrText xml:space="preserve"> PAGEREF _Toc232196093 \h </w:instrText>
         </w:r>
         <w:r>
           <w:rPr>
@@ -2254,7 +2254,7 @@
           <w14:ligatures w14:val="standardContextual"/>
         </w:rPr>
       </w:pPr>
-      <w:hyperlink w:anchor="_Toc232195948" w:history="1">
+      <w:hyperlink w:anchor="_Toc232196094" w:history="1">
         <w:r>
           <w:rPr>
             <w:rStyle w:val="Hyperlink"/>
@@ -2281,7 +2281,7 @@
             <w:noProof/>
             <w:webHidden/>
           </w:rPr>
-          <w:instrText xml:space="preserve"> PAGEREF _Toc232195948 \h </w:instrText>
+          <w:instrText xml:space="preserve"> PAGEREF _Toc232196094 \h </w:instrText>
         </w:r>
         <w:r>
           <w:rPr>
@@ -2327,7 +2327,7 @@
           <w14:ligatures w14:val="standardContextual"/>
         </w:rPr>
       </w:pPr>
-      <w:hyperlink w:anchor="_Toc232195949" w:history="1">
+      <w:hyperlink w:anchor="_Toc232196095" w:history="1">
         <w:r>
           <w:rPr>
             <w:rStyle w:val="Hyperlink"/>
@@ -2354,7 +2354,7 @@
             <w:noProof/>
             <w:webHidden/>
           </w:rPr>
-          <w:instrText xml:space="preserve"> PAGEREF _Toc232195949 \h </w:instrText>
+          <w:instrText xml:space="preserve"> PAGEREF _Toc232196095 \h </w:instrText>
         </w:r>
         <w:r>
           <w:rPr>
@@ -2400,7 +2400,7 @@
           <w14:ligatures w14:val="standardContextual"/>
         </w:rPr>
       </w:pPr>
-      <w:hyperlink w:anchor="_Toc232195950" w:history="1">
+      <w:hyperlink w:anchor="_Toc232196096" w:history="1">
         <w:r>
           <w:rPr>
             <w:rStyle w:val="Hyperlink"/>
@@ -2427,7 +2427,7 @@
             <w:noProof/>
             <w:webHidden/>
           </w:rPr>
-          <w:instrText xml:space="preserve"> PAGEREF _Toc232195950 \h </w:instrText>
+          <w:instrText xml:space="preserve"> PAGEREF _Toc232196096 \h </w:instrText>
         </w:r>
         <w:r>
           <w:rPr>
@@ -2473,7 +2473,7 @@
           <w14:ligatures w14:val="standardContextual"/>
         </w:rPr>
       </w:pPr>
-      <w:hyperlink w:anchor="_Toc232195951" w:history="1">
+      <w:hyperlink w:anchor="_Toc232196097" w:history="1">
         <w:r>
           <w:rPr>
             <w:rStyle w:val="Hyperlink"/>
@@ -2500,7 +2500,7 @@
             <w:noProof/>
             <w:webHidden/>
           </w:rPr>
-          <w:instrText xml:space="preserve"> PAGEREF _Toc232195951 \h </w:instrText>
+          <w:instrText xml:space="preserve"> PAGEREF _Toc232196097 \h </w:instrText>
         </w:r>
         <w:r>
           <w:rPr>
@@ -2546,7 +2546,7 @@
           <w14:ligatures w14:val="standardContextual"/>
         </w:rPr>
       </w:pPr>
-      <w:hyperlink w:anchor="_Toc232195952" w:history="1">
+      <w:hyperlink w:anchor="_Toc232196098" w:history="1">
         <w:r>
           <w:rPr>
             <w:rStyle w:val="Hyperlink"/>
@@ -2573,7 +2573,7 @@
             <w:noProof/>
             <w:webHidden/>
           </w:rPr>
-          <w:instrText xml:space="preserve"> PAGEREF _Toc232195952 \h </w:instrText>
+          <w:instrText xml:space="preserve"> PAGEREF _Toc232196098 \h </w:instrText>
         </w:r>
         <w:r>
           <w:rPr>
@@ -2619,7 +2619,7 @@
           <w14:ligatures w14:val="standardContextual"/>
         </w:rPr>
       </w:pPr>
-      <w:hyperlink w:anchor="_Toc232195953" w:history="1">
+      <w:hyperlink w:anchor="_Toc232196099" w:history="1">
         <w:r>
           <w:rPr>
             <w:rStyle w:val="Hyperlink"/>
@@ -2646,7 +2646,7 @@
             <w:noProof/>
             <w:webHidden/>
           </w:rPr>
-          <w:instrText xml:space="preserve"> PAGEREF _Toc232195953 \h </w:instrText>
+          <w:instrText xml:space="preserve"> PAGEREF _Toc232196099 \h </w:instrText>
         </w:r>
         <w:r>
           <w:rPr>
@@ -2692,7 +2692,7 @@
           <w14:ligatures w14:val="standardContextual"/>
         </w:rPr>
       </w:pPr>
-      <w:hyperlink w:anchor="_Toc232195954" w:history="1">
+      <w:hyperlink w:anchor="_Toc232196100" w:history="1">
         <w:r>
           <w:rPr>
             <w:rStyle w:val="Hyperlink"/>
@@ -2719,7 +2719,7 @@
             <w:noProof/>
             <w:webHidden/>
           </w:rPr>
-          <w:instrText xml:space="preserve"> PAGEREF _Toc232195954 \h </w:instrText>
+          <w:instrText xml:space="preserve"> PAGEREF _Toc232196100 \h </w:instrText>
         </w:r>
         <w:r>
           <w:rPr>
@@ -2765,7 +2765,7 @@
           <w14:ligatures w14:val="standardContextual"/>
         </w:rPr>
       </w:pPr>
-      <w:hyperlink w:anchor="_Toc232195955" w:history="1">
+      <w:hyperlink w:anchor="_Toc232196101" w:history="1">
         <w:r>
           <w:rPr>
             <w:rStyle w:val="Hyperlink"/>
@@ -2792,7 +2792,7 @@
             <w:noProof/>
             <w:webHidden/>
           </w:rPr>
-          <w:instrText xml:space="preserve"> PAGEREF _Toc232195955 \h </w:instrText>
+          <w:instrText xml:space="preserve"> PAGEREF _Toc232196101 \h </w:instrText>
         </w:r>
         <w:r>
           <w:rPr>
@@ -2838,7 +2838,7 @@
           <w14:ligatures w14:val="standardContextual"/>
         </w:rPr>
       </w:pPr>
-      <w:hyperlink w:anchor="_Toc232195956" w:history="1">
+      <w:hyperlink w:anchor="_Toc232196102" w:history="1">
         <w:r>
           <w:rPr>
             <w:rStyle w:val="Hyperlink"/>
@@ -2865,7 +2865,7 @@
             <w:noProof/>
             <w:webHidden/>
           </w:rPr>
-          <w:instrText xml:space="preserve"> PAGEREF _Toc232195956 \h </w:instrText>
+          <w:instrText xml:space="preserve"> PAGEREF _Toc232196102 \h </w:instrText>
         </w:r>
         <w:r>
           <w:rPr>
@@ -2911,7 +2911,7 @@
           <w14:ligatures w14:val="standardContextual"/>
         </w:rPr>
       </w:pPr>
-      <w:hyperlink w:anchor="_Toc232195957" w:history="1">
+      <w:hyperlink w:anchor="_Toc232196103" w:history="1">
         <w:r>
           <w:rPr>
             <w:rStyle w:val="Hyperlink"/>
@@ -2938,7 +2938,7 @@
             <w:noProof/>
             <w:webHidden/>
           </w:rPr>
-          <w:instrText xml:space="preserve"> PAGEREF _Toc232195957 \h </w:instrText>
+          <w:instrText xml:space="preserve"> PAGEREF _Toc232196103 \h </w:instrText>
         </w:r>
         <w:r>
           <w:rPr>
@@ -2984,7 +2984,7 @@
           <w14:ligatures w14:val="standardContextual"/>
         </w:rPr>
       </w:pPr>
-      <w:hyperlink w:anchor="_Toc232195958" w:history="1">
+      <w:hyperlink w:anchor="_Toc232196104" w:history="1">
         <w:r>
           <w:rPr>
             <w:rStyle w:val="Hyperlink"/>
@@ -3011,7 +3011,7 @@
             <w:noProof/>
             <w:webHidden/>
           </w:rPr>
-          <w:instrText xml:space="preserve"> PAGEREF _Toc232195958 \h </w:instrText>
+          <w:instrText xml:space="preserve"> PAGEREF _Toc232196104 \h </w:instrText>
         </w:r>
         <w:r>
           <w:rPr>
@@ -3057,7 +3057,7 @@
           <w14:ligatures w14:val="standardContextual"/>
         </w:rPr>
       </w:pPr>
-      <w:hyperlink w:anchor="_Toc232195959" w:history="1">
+      <w:hyperlink w:anchor="_Toc232196105" w:history="1">
         <w:r>
           <w:rPr>
             <w:rStyle w:val="Hyperlink"/>
@@ -3084,7 +3084,7 @@
             <w:noProof/>
             <w:webHidden/>
           </w:rPr>
-          <w:instrText xml:space="preserve"> PAGEREF _Toc232195959 \h </w:instrText>
+          <w:instrText xml:space="preserve"> PAGEREF _Toc232196105 \h </w:instrText>
         </w:r>
         <w:r>
           <w:rPr>
@@ -3130,7 +3130,7 @@
           <w14:ligatures w14:val="standardContextual"/>
         </w:rPr>
       </w:pPr>
-      <w:hyperlink w:anchor="_Toc232195960" w:history="1">
+      <w:hyperlink w:anchor="_Toc232196106" w:history="1">
         <w:r>
           <w:rPr>
             <w:rStyle w:val="Hyperlink"/>
@@ -3157,7 +3157,7 @@
             <w:noProof/>
             <w:webHidden/>
           </w:rPr>
-          <w:instrText xml:space="preserve"> PAGEREF _Toc232195960 \h </w:instrText>
+          <w:instrText xml:space="preserve"> PAGEREF _Toc232196106 \h </w:instrText>
         </w:r>
         <w:r>
           <w:rPr>
@@ -3203,7 +3203,7 @@
           <w14:ligatures w14:val="standardContextual"/>
         </w:rPr>
       </w:pPr>
-      <w:hyperlink w:anchor="_Toc232195961" w:history="1">
+      <w:hyperlink w:anchor="_Toc232196107" w:history="1">
         <w:r>
           <w:rPr>
             <w:rStyle w:val="Hyperlink"/>
@@ -3230,7 +3230,7 @@
             <w:noProof/>
             <w:webHidden/>
           </w:rPr>
-          <w:instrText xml:space="preserve"> PAGEREF _Toc232195961 \h </w:instrText>
+          <w:instrText xml:space="preserve"> PAGEREF _Toc232196107 \h </w:instrText>
         </w:r>
         <w:r>
           <w:rPr>
@@ -3276,7 +3276,7 @@
           <w14:ligatures w14:val="standardContextual"/>
         </w:rPr>
       </w:pPr>
-      <w:hyperlink w:anchor="_Toc232195962" w:history="1">
+      <w:hyperlink w:anchor="_Toc232196108" w:history="1">
         <w:r>
           <w:rPr>
             <w:rStyle w:val="Hyperlink"/>
@@ -3303,7 +3303,7 @@
             <w:noProof/>
             <w:webHidden/>
           </w:rPr>
-          <w:instrText xml:space="preserve"> PAGEREF _Toc232195962 \h </w:instrText>
+          <w:instrText xml:space="preserve"> PAGEREF _Toc232196108 \h </w:instrText>
         </w:r>
         <w:r>
           <w:rPr>
@@ -3349,7 +3349,7 @@
           <w14:ligatures w14:val="standardContextual"/>
         </w:rPr>
       </w:pPr>
-      <w:hyperlink w:anchor="_Toc232195963" w:history="1">
+      <w:hyperlink w:anchor="_Toc232196109" w:history="1">
         <w:r>
           <w:rPr>
             <w:rStyle w:val="Hyperlink"/>
@@ -3376,7 +3376,7 @@
             <w:noProof/>
             <w:webHidden/>
           </w:rPr>
-          <w:instrText xml:space="preserve"> PAGEREF _Toc232195963 \h </w:instrText>
+          <w:instrText xml:space="preserve"> PAGEREF _Toc232196109 \h </w:instrText>
         </w:r>
         <w:r>
           <w:rPr>
@@ -3422,7 +3422,7 @@
           <w14:ligatures w14:val="standardContextual"/>
         </w:rPr>
       </w:pPr>
-      <w:hyperlink w:anchor="_Toc232195964" w:history="1">
+      <w:hyperlink w:anchor="_Toc232196110" w:history="1">
         <w:r>
           <w:rPr>
             <w:rStyle w:val="Hyperlink"/>
@@ -3449,7 +3449,7 @@
             <w:noProof/>
             <w:webHidden/>
           </w:rPr>
-          <w:instrText xml:space="preserve"> PAGEREF _Toc232195964 \h </w:instrText>
+          <w:instrText xml:space="preserve"> PAGEREF _Toc232196110 \h </w:instrText>
         </w:r>
         <w:r>
           <w:rPr>
@@ -3495,7 +3495,7 @@
           <w14:ligatures w14:val="standardContextual"/>
         </w:rPr>
       </w:pPr>
-      <w:hyperlink w:anchor="_Toc232195965" w:history="1">
+      <w:hyperlink w:anchor="_Toc232196111" w:history="1">
         <w:r>
           <w:rPr>
             <w:rStyle w:val="Hyperlink"/>
@@ -3522,7 +3522,7 @@
             <w:noProof/>
             <w:webHidden/>
           </w:rPr>
-          <w:instrText xml:space="preserve"> PAGEREF _Toc232195965 \h </w:instrText>
+          <w:instrText xml:space="preserve"> PAGEREF _Toc232196111 \h </w:instrText>
         </w:r>
         <w:r>
           <w:rPr>
@@ -3568,7 +3568,7 @@
           <w14:ligatures w14:val="standardContextual"/>
         </w:rPr>
       </w:pPr>
-      <w:hyperlink w:anchor="_Toc232195966" w:history="1">
+      <w:hyperlink w:anchor="_Toc232196112" w:history="1">
         <w:r>
           <w:rPr>
             <w:rStyle w:val="Hyperlink"/>
@@ -3595,7 +3595,7 @@
             <w:noProof/>
             <w:webHidden/>
           </w:rPr>
-          <w:instrText xml:space="preserve"> PAGEREF _Toc232195966 \h </w:instrText>
+          <w:instrText xml:space="preserve"> PAGEREF _Toc232196112 \h </w:instrText>
         </w:r>
         <w:r>
           <w:rPr>
@@ -3641,7 +3641,7 @@
           <w14:ligatures w14:val="standardContextual"/>
         </w:rPr>
       </w:pPr>
-      <w:hyperlink w:anchor="_Toc232195967" w:history="1">
+      <w:hyperlink w:anchor="_Toc232196113" w:history="1">
         <w:r>
           <w:rPr>
             <w:rStyle w:val="Hyperlink"/>
@@ -3668,7 +3668,7 @@
             <w:noProof/>
             <w:webHidden/>
           </w:rPr>
-          <w:instrText xml:space="preserve"> PAGEREF _Toc232195967 \h </w:instrText>
+          <w:instrText xml:space="preserve"> PAGEREF _Toc232196113 \h </w:instrText>
         </w:r>
         <w:r>
           <w:rPr>
@@ -3714,7 +3714,7 @@
           <w14:ligatures w14:val="standardContextual"/>
         </w:rPr>
       </w:pPr>
-      <w:hyperlink w:anchor="_Toc232195968" w:history="1">
+      <w:hyperlink w:anchor="_Toc232196114" w:history="1">
         <w:r>
           <w:rPr>
             <w:rStyle w:val="Hyperlink"/>
@@ -3741,7 +3741,7 @@
             <w:noProof/>
             <w:webHidden/>
           </w:rPr>
-          <w:instrText xml:space="preserve"> PAGEREF _Toc232195968 \h </w:instrText>
+          <w:instrText xml:space="preserve"> PAGEREF _Toc232196114 \h </w:instrText>
         </w:r>
         <w:r>
           <w:rPr>
@@ -3787,7 +3787,7 @@
           <w14:ligatures w14:val="standardContextual"/>
         </w:rPr>
       </w:pPr>
-      <w:hyperlink w:anchor="_Toc232195969" w:history="1">
+      <w:hyperlink w:anchor="_Toc232196115" w:history="1">
         <w:r>
           <w:rPr>
             <w:rStyle w:val="Hyperlink"/>
@@ -3814,7 +3814,7 @@
             <w:noProof/>
             <w:webHidden/>
           </w:rPr>
-          <w:instrText xml:space="preserve"> PAGEREF _Toc232195969 \h </w:instrText>
+          <w:instrText xml:space="preserve"> PAGEREF _Toc232196115 \h </w:instrText>
         </w:r>
         <w:r>
           <w:rPr>
@@ -3860,7 +3860,7 @@
           <w14:ligatures w14:val="standardContextual"/>
         </w:rPr>
       </w:pPr>
-      <w:hyperlink w:anchor="_Toc232195970" w:history="1">
+      <w:hyperlink w:anchor="_Toc232196116" w:history="1">
         <w:r>
           <w:rPr>
             <w:rStyle w:val="Hyperlink"/>
@@ -3887,7 +3887,7 @@
             <w:noProof/>
             <w:webHidden/>
           </w:rPr>
-          <w:instrText xml:space="preserve"> PAGEREF _Toc232195970 \h </w:instrText>
+          <w:instrText xml:space="preserve"> PAGEREF _Toc232196116 \h </w:instrText>
         </w:r>
         <w:r>
           <w:rPr>
@@ -3933,7 +3933,7 @@
           <w14:ligatures w14:val="standardContextual"/>
         </w:rPr>
       </w:pPr>
-      <w:hyperlink w:anchor="_Toc232195971" w:history="1">
+      <w:hyperlink w:anchor="_Toc232196117" w:history="1">
         <w:r>
           <w:rPr>
             <w:rStyle w:val="Hyperlink"/>
@@ -3960,7 +3960,7 @@
             <w:noProof/>
             <w:webHidden/>
           </w:rPr>
-          <w:instrText xml:space="preserve"> PAGEREF _Toc232195971 \h </w:instrText>
+          <w:instrText xml:space="preserve"> PAGEREF _Toc232196117 \h </w:instrText>
         </w:r>
         <w:r>
           <w:rPr>
@@ -4006,7 +4006,7 @@
           <w14:ligatures w14:val="standardContextual"/>
         </w:rPr>
       </w:pPr>
-      <w:hyperlink w:anchor="_Toc232195972" w:history="1">
+      <w:hyperlink w:anchor="_Toc232196118" w:history="1">
         <w:r>
           <w:rPr>
             <w:rStyle w:val="Hyperlink"/>
@@ -4033,7 +4033,7 @@
             <w:noProof/>
             <w:webHidden/>
           </w:rPr>
-          <w:instrText xml:space="preserve"> PAGEREF _Toc232195972 \h </w:instrText>
+          <w:instrText xml:space="preserve"> PAGEREF _Toc232196118 \h </w:instrText>
         </w:r>
         <w:r>
           <w:rPr>
@@ -4079,7 +4079,7 @@
           <w14:ligatures w14:val="standardContextual"/>
         </w:rPr>
       </w:pPr>
-      <w:hyperlink w:anchor="_Toc232195973" w:history="1">
+      <w:hyperlink w:anchor="_Toc232196119" w:history="1">
         <w:r>
           <w:rPr>
             <w:rStyle w:val="Hyperlink"/>
@@ -4106,7 +4106,7 @@
             <w:noProof/>
             <w:webHidden/>
           </w:rPr>
-          <w:instrText xml:space="preserve"> PAGEREF _Toc232195973 \h </w:instrText>
+          <w:instrText xml:space="preserve"> PAGEREF _Toc232196119 \h </w:instrText>
         </w:r>
         <w:r>
           <w:rPr>
@@ -4152,7 +4152,7 @@
           <w14:ligatures w14:val="standardContextual"/>
         </w:rPr>
       </w:pPr>
-      <w:hyperlink w:anchor="_Toc232195974" w:history="1">
+      <w:hyperlink w:anchor="_Toc232196120" w:history="1">
         <w:r>
           <w:rPr>
             <w:rStyle w:val="Hyperlink"/>
@@ -4179,7 +4179,7 @@
             <w:noProof/>
             <w:webHidden/>
           </w:rPr>
-          <w:instrText xml:space="preserve"> PAGEREF _Toc232195974 \h </w:instrText>
+          <w:instrText xml:space="preserve"> PAGEREF _Toc232196120 \h </w:instrText>
         </w:r>
         <w:r>
           <w:rPr>
@@ -4225,7 +4225,7 @@
           <w14:ligatures w14:val="standardContextual"/>
         </w:rPr>
       </w:pPr>
-      <w:hyperlink w:anchor="_Toc232195975" w:history="1">
+      <w:hyperlink w:anchor="_Toc232196121" w:history="1">
         <w:r>
           <w:rPr>
             <w:rStyle w:val="Hyperlink"/>
@@ -4252,7 +4252,7 @@
             <w:noProof/>
             <w:webHidden/>
           </w:rPr>
-          <w:instrText xml:space="preserve"> PAGEREF _Toc232195975 \h </w:instrText>
+          <w:instrText xml:space="preserve"> PAGEREF _Toc232196121 \h </w:instrText>
         </w:r>
         <w:r>
           <w:rPr>
@@ -4298,7 +4298,7 @@
           <w14:ligatures w14:val="standardContextual"/>
         </w:rPr>
       </w:pPr>
-      <w:hyperlink w:anchor="_Toc232195976" w:history="1">
+      <w:hyperlink w:anchor="_Toc232196122" w:history="1">
         <w:r>
           <w:rPr>
             <w:rStyle w:val="Hyperlink"/>
@@ -4325,7 +4325,7 @@
             <w:noProof/>
             <w:webHidden/>
           </w:rPr>
-          <w:instrText xml:space="preserve"> PAGEREF _Toc232195976 \h </w:instrText>
+          <w:instrText xml:space="preserve"> PAGEREF _Toc232196122 \h </w:instrText>
         </w:r>
         <w:r>
           <w:rPr>
@@ -4371,7 +4371,7 @@
           <w14:ligatures w14:val="standardContextual"/>
         </w:rPr>
       </w:pPr>
-      <w:hyperlink w:anchor="_Toc232195977" w:history="1">
+      <w:hyperlink w:anchor="_Toc232196123" w:history="1">
         <w:r>
           <w:rPr>
             <w:rStyle w:val="Hyperlink"/>
@@ -4398,7 +4398,7 @@
             <w:noProof/>
             <w:webHidden/>
           </w:rPr>
-          <w:instrText xml:space="preserve"> PAGEREF _Toc232195977 \h </w:instrText>
+          <w:instrText xml:space="preserve"> PAGEREF _Toc232196123 \h </w:instrText>
         </w:r>
         <w:r>
           <w:rPr>
@@ -4444,7 +4444,7 @@
           <w14:ligatures w14:val="standardContextual"/>
         </w:rPr>
       </w:pPr>
-      <w:hyperlink w:anchor="_Toc232195978" w:history="1">
+      <w:hyperlink w:anchor="_Toc232196124" w:history="1">
         <w:r>
           <w:rPr>
             <w:rStyle w:val="Hyperlink"/>
@@ -4471,7 +4471,7 @@
             <w:noProof/>
             <w:webHidden/>
           </w:rPr>
-          <w:instrText xml:space="preserve"> PAGEREF _Toc232195978 \h </w:instrText>
+          <w:instrText xml:space="preserve"> PAGEREF _Toc232196124 \h </w:instrText>
         </w:r>
         <w:r>
           <w:rPr>
@@ -4517,7 +4517,7 @@
           <w14:ligatures w14:val="standardContextual"/>
         </w:rPr>
       </w:pPr>
-      <w:hyperlink w:anchor="_Toc232195979" w:history="1">
+      <w:hyperlink w:anchor="_Toc232196125" w:history="1">
         <w:r>
           <w:rPr>
             <w:rStyle w:val="Hyperlink"/>
@@ -4544,7 +4544,7 @@
             <w:noProof/>
             <w:webHidden/>
           </w:rPr>
-          <w:instrText xml:space="preserve"> PAGEREF _Toc232195979 \h </w:instrText>
+          <w:instrText xml:space="preserve"> PAGEREF _Toc232196125 \h </w:instrText>
         </w:r>
         <w:r>
           <w:rPr>
@@ -4590,7 +4590,7 @@
           <w14:ligatures w14:val="standardContextual"/>
         </w:rPr>
       </w:pPr>
-      <w:hyperlink w:anchor="_Toc232195980" w:history="1">
+      <w:hyperlink w:anchor="_Toc232196126" w:history="1">
         <w:r>
           <w:rPr>
             <w:rStyle w:val="Hyperlink"/>
@@ -4617,7 +4617,7 @@
             <w:noProof/>
             <w:webHidden/>
           </w:rPr>
-          <w:instrText xml:space="preserve"> PAGEREF _Toc232195980 \h </w:instrText>
+          <w:instrText xml:space="preserve"> PAGEREF _Toc232196126 \h </w:instrText>
         </w:r>
         <w:r>
           <w:rPr>
@@ -4663,7 +4663,7 @@
           <w14:ligatures w14:val="standardContextual"/>
         </w:rPr>
       </w:pPr>
-      <w:hyperlink w:anchor="_Toc232195981" w:history="1">
+      <w:hyperlink w:anchor="_Toc232196127" w:history="1">
         <w:r>
           <w:rPr>
             <w:rStyle w:val="Hyperlink"/>
@@ -4690,7 +4690,7 @@
             <w:noProof/>
             <w:webHidden/>
           </w:rPr>
-          <w:instrText xml:space="preserve"> PAGEREF _Toc232195981 \h </w:instrText>
+          <w:instrText xml:space="preserve"> PAGEREF _Toc232196127 \h </w:instrText>
         </w:r>
         <w:r>
           <w:rPr>
@@ -4736,7 +4736,7 @@
           <w14:ligatures w14:val="standardContextual"/>
         </w:rPr>
       </w:pPr>
-      <w:hyperlink w:anchor="_Toc232195982" w:history="1">
+      <w:hyperlink w:anchor="_Toc232196128" w:history="1">
         <w:r>
           <w:rPr>
             <w:rStyle w:val="Hyperlink"/>
@@ -4763,7 +4763,7 @@
             <w:noProof/>
             <w:webHidden/>
           </w:rPr>
-          <w:instrText xml:space="preserve"> PAGEREF _Toc232195982 \h </w:instrText>
+          <w:instrText xml:space="preserve"> PAGEREF _Toc232196128 \h </w:instrText>
         </w:r>
         <w:r>
           <w:rPr>
@@ -4809,7 +4809,7 @@
           <w14:ligatures w14:val="standardContextual"/>
         </w:rPr>
       </w:pPr>
-      <w:hyperlink w:anchor="_Toc232195983" w:history="1">
+      <w:hyperlink w:anchor="_Toc232196129" w:history="1">
         <w:r>
           <w:rPr>
             <w:rStyle w:val="Hyperlink"/>
@@ -4836,7 +4836,7 @@
             <w:noProof/>
             <w:webHidden/>
           </w:rPr>
-          <w:instrText xml:space="preserve"> PAGEREF _Toc232195983 \h </w:instrText>
+          <w:instrText xml:space="preserve"> PAGEREF _Toc232196129 \h </w:instrText>
         </w:r>
         <w:r>
           <w:rPr>
@@ -4882,7 +4882,7 @@
           <w14:ligatures w14:val="standardContextual"/>
         </w:rPr>
       </w:pPr>
-      <w:hyperlink w:anchor="_Toc232195984" w:history="1">
+      <w:hyperlink w:anchor="_Toc232196130" w:history="1">
         <w:r>
           <w:rPr>
             <w:rStyle w:val="Hyperlink"/>
@@ -4909,7 +4909,7 @@
             <w:noProof/>
             <w:webHidden/>
           </w:rPr>
-          <w:instrText xml:space="preserve"> PAGEREF _Toc232195984 \h </w:instrText>
+          <w:instrText xml:space="preserve"> PAGEREF _Toc232196130 \h </w:instrText>
         </w:r>
         <w:r>
           <w:rPr>
@@ -4955,7 +4955,7 @@
           <w14:ligatures w14:val="standardContextual"/>
         </w:rPr>
       </w:pPr>
-      <w:hyperlink w:anchor="_Toc232195985" w:history="1">
+      <w:hyperlink w:anchor="_Toc232196131" w:history="1">
         <w:r>
           <w:rPr>
             <w:rStyle w:val="Hyperlink"/>
@@ -4982,7 +4982,7 @@
             <w:noProof/>
             <w:webHidden/>
           </w:rPr>
-          <w:instrText xml:space="preserve"> PAGEREF _Toc232195985 \h </w:instrText>
+          <w:instrText xml:space="preserve"> PAGEREF _Toc232196131 \h </w:instrText>
         </w:r>
         <w:r>
           <w:rPr>
@@ -5028,7 +5028,7 @@
           <w14:ligatures w14:val="standardContextual"/>
         </w:rPr>
       </w:pPr>
-      <w:hyperlink w:anchor="_Toc232195986" w:history="1">
+      <w:hyperlink w:anchor="_Toc232196132" w:history="1">
         <w:r>
           <w:rPr>
             <w:rStyle w:val="Hyperlink"/>
@@ -5055,7 +5055,7 @@
             <w:noProof/>
             <w:webHidden/>
           </w:rPr>
-          <w:instrText xml:space="preserve"> PAGEREF _Toc232195986 \h </w:instrText>
+          <w:instrText xml:space="preserve"> PAGEREF _Toc232196132 \h </w:instrText>
         </w:r>
         <w:r>
           <w:rPr>
@@ -5101,7 +5101,7 @@
           <w14:ligatures w14:val="standardContextual"/>
         </w:rPr>
       </w:pPr>
-      <w:hyperlink w:anchor="_Toc232195987" w:history="1">
+      <w:hyperlink w:anchor="_Toc232196133" w:history="1">
         <w:r>
           <w:rPr>
             <w:rStyle w:val="Hyperlink"/>
@@ -5128,7 +5128,7 @@
             <w:noProof/>
             <w:webHidden/>
           </w:rPr>
-          <w:instrText xml:space="preserve"> PAGEREF _Toc232195987 \h </w:instrText>
+          <w:instrText xml:space="preserve"> PAGEREF _Toc232196133 \h </w:instrText>
         </w:r>
         <w:r>
           <w:rPr>
@@ -5174,7 +5174,7 @@
           <w14:ligatures w14:val="standardContextual"/>
         </w:rPr>
       </w:pPr>
-      <w:hyperlink w:anchor="_Toc232195988" w:history="1">
+      <w:hyperlink w:anchor="_Toc232196134" w:history="1">
         <w:r>
           <w:rPr>
             <w:rStyle w:val="Hyperlink"/>
@@ -5201,7 +5201,7 @@
             <w:noProof/>
             <w:webHidden/>
           </w:rPr>
-          <w:instrText xml:space="preserve"> PAGEREF _Toc232195988 \h </w:instrText>
+          <w:instrText xml:space="preserve"> PAGEREF _Toc232196134 \h </w:instrText>
         </w:r>
         <w:r>
           <w:rPr>
@@ -5247,7 +5247,7 @@
           <w14:ligatures w14:val="standardContextual"/>
         </w:rPr>
       </w:pPr>
-      <w:hyperlink w:anchor="_Toc232195989" w:history="1">
+      <w:hyperlink w:anchor="_Toc232196135" w:history="1">
         <w:r>
           <w:rPr>
             <w:rStyle w:val="Hyperlink"/>
@@ -5274,7 +5274,7 @@
             <w:noProof/>
             <w:webHidden/>
           </w:rPr>
-          <w:instrText xml:space="preserve"> PAGEREF _Toc232195989 \h </w:instrText>
+          <w:instrText xml:space="preserve"> PAGEREF _Toc232196135 \h </w:instrText>
         </w:r>
         <w:r>
           <w:rPr>
@@ -5320,7 +5320,7 @@
           <w14:ligatures w14:val="standardContextual"/>
         </w:rPr>
       </w:pPr>
-      <w:hyperlink w:anchor="_Toc232195990" w:history="1">
+      <w:hyperlink w:anchor="_Toc232196136" w:history="1">
         <w:r>
           <w:rPr>
             <w:rStyle w:val="Hyperlink"/>
@@ -5347,7 +5347,7 @@
             <w:noProof/>
             <w:webHidden/>
           </w:rPr>
-          <w:instrText xml:space="preserve"> PAGEREF _Toc232195990 \h </w:instrText>
+          <w:instrText xml:space="preserve"> PAGEREF _Toc232196136 \h </w:instrText>
         </w:r>
         <w:r>
           <w:rPr>
@@ -5393,7 +5393,7 @@
           <w14:ligatures w14:val="standardContextual"/>
         </w:rPr>
       </w:pPr>
-      <w:hyperlink w:anchor="_Toc232195991" w:history="1">
+      <w:hyperlink w:anchor="_Toc232196137" w:history="1">
         <w:r>
           <w:rPr>
             <w:rStyle w:val="Hyperlink"/>
@@ -5420,7 +5420,7 @@
             <w:noProof/>
             <w:webHidden/>
           </w:rPr>
-          <w:instrText xml:space="preserve"> PAGEREF _Toc232195991 \h </w:instrText>
+          <w:instrText xml:space="preserve"> PAGEREF _Toc232196137 \h </w:instrText>
         </w:r>
         <w:r>
           <w:rPr>
@@ -5466,7 +5466,7 @@
           <w14:ligatures w14:val="standardContextual"/>
         </w:rPr>
       </w:pPr>
-      <w:hyperlink w:anchor="_Toc232195992" w:history="1">
+      <w:hyperlink w:anchor="_Toc232196138" w:history="1">
         <w:r>
           <w:rPr>
             <w:rStyle w:val="Hyperlink"/>
@@ -5493,7 +5493,7 @@
             <w:noProof/>
             <w:webHidden/>
           </w:rPr>
-          <w:instrText xml:space="preserve"> PAGEREF _Toc232195992 \h </w:instrText>
+          <w:instrText xml:space="preserve"> PAGEREF _Toc232196138 \h </w:instrText>
         </w:r>
         <w:r>
           <w:rPr>
@@ -5539,7 +5539,7 @@
           <w14:ligatures w14:val="standardContextual"/>
         </w:rPr>
       </w:pPr>
-      <w:hyperlink w:anchor="_Toc232195993" w:history="1">
+      <w:hyperlink w:anchor="_Toc232196139" w:history="1">
         <w:r>
           <w:rPr>
             <w:rStyle w:val="Hyperlink"/>
@@ -5566,7 +5566,7 @@
             <w:noProof/>
             <w:webHidden/>
           </w:rPr>
-          <w:instrText xml:space="preserve"> PAGEREF _Toc232195993 \h </w:instrText>
+          <w:instrText xml:space="preserve"> PAGEREF _Toc232196139 \h </w:instrText>
         </w:r>
         <w:r>
           <w:rPr>
@@ -5612,7 +5612,7 @@
           <w14:ligatures w14:val="standardContextual"/>
         </w:rPr>
       </w:pPr>
-      <w:hyperlink w:anchor="_Toc232195994" w:history="1">
+      <w:hyperlink w:anchor="_Toc232196140" w:history="1">
         <w:r>
           <w:rPr>
             <w:rStyle w:val="Hyperlink"/>
@@ -5639,7 +5639,7 @@
             <w:noProof/>
             <w:webHidden/>
           </w:rPr>
-          <w:instrText xml:space="preserve"> PAGEREF _Toc232195994 \h </w:instrText>
+          <w:instrText xml:space="preserve"> PAGEREF _Toc232196140 \h </w:instrText>
         </w:r>
         <w:r>
           <w:rPr>
@@ -5685,7 +5685,7 @@
           <w14:ligatures w14:val="standardContextual"/>
         </w:rPr>
       </w:pPr>
-      <w:hyperlink w:anchor="_Toc232195995" w:history="1">
+      <w:hyperlink w:anchor="_Toc232196141" w:history="1">
         <w:r>
           <w:rPr>
             <w:rStyle w:val="Hyperlink"/>
@@ -5712,7 +5712,7 @@
             <w:noProof/>
             <w:webHidden/>
           </w:rPr>
-          <w:instrText xml:space="preserve"> PAGEREF _Toc232195995 \h </w:instrText>
+          <w:instrText xml:space="preserve"> PAGEREF _Toc232196141 \h </w:instrText>
         </w:r>
         <w:r>
           <w:rPr>
@@ -5758,7 +5758,7 @@
           <w14:ligatures w14:val="standardContextual"/>
         </w:rPr>
       </w:pPr>
-      <w:hyperlink w:anchor="_Toc232195996" w:history="1">
+      <w:hyperlink w:anchor="_Toc232196142" w:history="1">
         <w:r>
           <w:rPr>
             <w:rStyle w:val="Hyperlink"/>
@@ -5785,7 +5785,7 @@
             <w:noProof/>
             <w:webHidden/>
           </w:rPr>
-          <w:instrText xml:space="preserve"> PAGEREF _Toc232195996 \h </w:instrText>
+          <w:instrText xml:space="preserve"> PAGEREF _Toc232196142 \h </w:instrText>
         </w:r>
         <w:r>
           <w:rPr>
@@ -5831,7 +5831,7 @@
           <w14:ligatures w14:val="standardContextual"/>
         </w:rPr>
       </w:pPr>
-      <w:hyperlink w:anchor="_Toc232195997" w:history="1">
+      <w:hyperlink w:anchor="_Toc232196143" w:history="1">
         <w:r>
           <w:rPr>
             <w:rStyle w:val="Hyperlink"/>
@@ -5858,7 +5858,7 @@
             <w:noProof/>
             <w:webHidden/>
           </w:rPr>
-          <w:instrText xml:space="preserve"> PAGEREF _Toc232195997 \h </w:instrText>
+          <w:instrText xml:space="preserve"> PAGEREF _Toc232196143 \h </w:instrText>
         </w:r>
         <w:r>
           <w:rPr>
@@ -5904,7 +5904,7 @@
           <w14:ligatures w14:val="standardContextual"/>
         </w:rPr>
       </w:pPr>
-      <w:hyperlink w:anchor="_Toc232195998" w:history="1">
+      <w:hyperlink w:anchor="_Toc232196144" w:history="1">
         <w:r>
           <w:rPr>
             <w:rStyle w:val="Hyperlink"/>
@@ -5931,7 +5931,7 @@
             <w:noProof/>
             <w:webHidden/>
           </w:rPr>
-          <w:instrText xml:space="preserve"> PAGEREF _Toc232195998 \h </w:instrText>
+          <w:instrText xml:space="preserve"> PAGEREF _Toc232196144 \h </w:instrText>
         </w:r>
         <w:r>
           <w:rPr>
@@ -5977,7 +5977,7 @@
           <w14:ligatures w14:val="standardContextual"/>
         </w:rPr>
       </w:pPr>
-      <w:hyperlink w:anchor="_Toc232195999" w:history="1">
+      <w:hyperlink w:anchor="_Toc232196145" w:history="1">
         <w:r>
           <w:rPr>
             <w:rStyle w:val="Hyperlink"/>
@@ -6004,7 +6004,7 @@
             <w:noProof/>
             <w:webHidden/>
           </w:rPr>
-          <w:instrText xml:space="preserve"> PAGEREF _Toc232195999 \h </w:instrText>
+          <w:instrText xml:space="preserve"> PAGEREF _Toc232196145 \h </w:instrText>
         </w:r>
         <w:r>
           <w:rPr>
@@ -6050,7 +6050,7 @@
           <w14:ligatures w14:val="standardContextual"/>
         </w:rPr>
       </w:pPr>
-      <w:hyperlink w:anchor="_Toc232196000" w:history="1">
+      <w:hyperlink w:anchor="_Toc232196146" w:history="1">
         <w:r>
           <w:rPr>
             <w:rStyle w:val="Hyperlink"/>
@@ -6077,7 +6077,7 @@
             <w:noProof/>
             <w:webHidden/>
           </w:rPr>
-          <w:instrText xml:space="preserve"> PAGEREF _Toc232196000 \h </w:instrText>
+          <w:instrText xml:space="preserve"> PAGEREF _Toc232196146 \h </w:instrText>
         </w:r>
         <w:r>
           <w:rPr>
@@ -6123,7 +6123,7 @@
           <w14:ligatures w14:val="standardContextual"/>
         </w:rPr>
       </w:pPr>
-      <w:hyperlink w:anchor="_Toc232196001" w:history="1">
+      <w:hyperlink w:anchor="_Toc232196147" w:history="1">
         <w:r>
           <w:rPr>
             <w:rStyle w:val="Hyperlink"/>
@@ -6150,7 +6150,7 @@
             <w:noProof/>
             <w:webHidden/>
           </w:rPr>
-          <w:instrText xml:space="preserve"> PAGEREF _Toc232196001 \h </w:instrText>
+          <w:instrText xml:space="preserve"> PAGEREF _Toc232196147 \h </w:instrText>
         </w:r>
         <w:r>
           <w:rPr>
@@ -6198,7 +6198,7 @@
       <w:pPr>
         <w:pStyle w:val="Heading1"/>
       </w:pPr>
-      <w:bookmarkStart w:id="3" w:name="_Toc232195935"/>
+      <w:bookmarkStart w:id="3" w:name="_Toc232196081"/>
       <w:r>
         <w:rPr>
           <w:rFonts w:ascii="Times New Roman" w:eastAsia="Times New Roman" w:hAnsi="Times New Roman"/>
@@ -6231,7 +6231,7 @@
       <w:r>
         <w:fldChar w:fldCharType="separate"/>
       </w:r>
-      <w:hyperlink w:anchor="_Toc232196002" w:history="1">
+      <w:hyperlink w:anchor="_Toc232196148" w:history="1">
         <w:r>
           <w:rPr>
             <w:rStyle w:val="Hyperlink"/>
@@ -6258,7 +6258,7 @@
             <w:noProof/>
             <w:webHidden/>
           </w:rPr>
-          <w:instrText xml:space="preserve"> PAGEREF _Toc232196002 \h </w:instrText>
+          <w:instrText xml:space="preserve"> PAGEREF _Toc232196148 \h </w:instrText>
         </w:r>
         <w:r>
           <w:rPr>
@@ -6304,7 +6304,7 @@
           <w14:ligatures w14:val="standardContextual"/>
         </w:rPr>
       </w:pPr>
-      <w:hyperlink w:anchor="_Toc232196003" w:history="1">
+      <w:hyperlink w:anchor="_Toc232196149" w:history="1">
         <w:r>
           <w:rPr>
             <w:rStyle w:val="Hyperlink"/>
@@ -6331,7 +6331,7 @@
             <w:noProof/>
             <w:webHidden/>
           </w:rPr>
-          <w:instrText xml:space="preserve"> PAGEREF _Toc232196003 \h </w:instrText>
+          <w:instrText xml:space="preserve"> PAGEREF _Toc232196149 \h </w:instrText>
         </w:r>
         <w:r>
           <w:rPr>
@@ -6377,7 +6377,7 @@
           <w14:ligatures w14:val="standardContextual"/>
         </w:rPr>
       </w:pPr>
-      <w:hyperlink w:anchor="_Toc232196004" w:history="1">
+      <w:hyperlink w:anchor="_Toc232196150" w:history="1">
         <w:r>
           <w:rPr>
             <w:rStyle w:val="Hyperlink"/>
@@ -6404,7 +6404,7 @@
             <w:noProof/>
             <w:webHidden/>
           </w:rPr>
-          <w:instrText xml:space="preserve"> PAGEREF _Toc232196004 \h </w:instrText>
+          <w:instrText xml:space="preserve"> PAGEREF _Toc232196150 \h </w:instrText>
         </w:r>
         <w:r>
           <w:rPr>
@@ -6450,7 +6450,7 @@
           <w14:ligatures w14:val="standardContextual"/>
         </w:rPr>
       </w:pPr>
-      <w:hyperlink w:anchor="_Toc232196005" w:history="1">
+      <w:hyperlink w:anchor="_Toc232196151" w:history="1">
         <w:r>
           <w:rPr>
             <w:rStyle w:val="Hyperlink"/>
@@ -6477,7 +6477,7 @@
             <w:noProof/>
             <w:webHidden/>
           </w:rPr>
-          <w:instrText xml:space="preserve"> PAGEREF _Toc232196005 \h </w:instrText>
+          <w:instrText xml:space="preserve"> PAGEREF _Toc232196151 \h </w:instrText>
         </w:r>
         <w:r>
           <w:rPr>
@@ -6523,7 +6523,7 @@
           <w14:ligatures w14:val="standardContextual"/>
         </w:rPr>
       </w:pPr>
-      <w:hyperlink w:anchor="_Toc232196006" w:history="1">
+      <w:hyperlink w:anchor="_Toc232196152" w:history="1">
         <w:r>
           <w:rPr>
             <w:rStyle w:val="Hyperlink"/>
@@ -6550,7 +6550,7 @@
             <w:noProof/>
             <w:webHidden/>
           </w:rPr>
-          <w:instrText xml:space="preserve"> PAGEREF _Toc232196006 \h </w:instrText>
+          <w:instrText xml:space="preserve"> PAGEREF _Toc232196152 \h </w:instrText>
         </w:r>
         <w:r>
           <w:rPr>
@@ -6596,7 +6596,7 @@
           <w14:ligatures w14:val="standardContextual"/>
         </w:rPr>
       </w:pPr>
-      <w:hyperlink w:anchor="_Toc232196007" w:history="1">
+      <w:hyperlink w:anchor="_Toc232196153" w:history="1">
         <w:r>
           <w:rPr>
             <w:rStyle w:val="Hyperlink"/>
@@ -6623,7 +6623,7 @@
             <w:noProof/>
             <w:webHidden/>
           </w:rPr>
-          <w:instrText xml:space="preserve"> PAGEREF _Toc232196007 \h </w:instrText>
+          <w:instrText xml:space="preserve"> PAGEREF _Toc232196153 \h </w:instrText>
         </w:r>
         <w:r>
           <w:rPr>
@@ -6669,7 +6669,7 @@
           <w14:ligatures w14:val="standardContextual"/>
         </w:rPr>
       </w:pPr>
-      <w:hyperlink w:anchor="_Toc232196008" w:history="1">
+      <w:hyperlink w:anchor="_Toc232196154" w:history="1">
         <w:r>
           <w:rPr>
             <w:rStyle w:val="Hyperlink"/>
@@ -6696,7 +6696,7 @@
             <w:noProof/>
             <w:webHidden/>
           </w:rPr>
-          <w:instrText xml:space="preserve"> PAGEREF _Toc232196008 \h </w:instrText>
+          <w:instrText xml:space="preserve"> PAGEREF _Toc232196154 \h </w:instrText>
         </w:r>
         <w:r>
           <w:rPr>
@@ -6742,7 +6742,7 @@
           <w14:ligatures w14:val="standardContextual"/>
         </w:rPr>
       </w:pPr>
-      <w:hyperlink w:anchor="_Toc232196009" w:history="1">
+      <w:hyperlink w:anchor="_Toc232196155" w:history="1">
         <w:r>
           <w:rPr>
             <w:rStyle w:val="Hyperlink"/>
@@ -6769,7 +6769,7 @@
             <w:noProof/>
             <w:webHidden/>
           </w:rPr>
-          <w:instrText xml:space="preserve"> PAGEREF _Toc232196009 \h </w:instrText>
+          <w:instrText xml:space="preserve"> PAGEREF _Toc232196155 \h </w:instrText>
         </w:r>
         <w:r>
           <w:rPr>
@@ -6815,7 +6815,7 @@
           <w14:ligatures w14:val="standardContextual"/>
         </w:rPr>
       </w:pPr>
-      <w:hyperlink w:anchor="_Toc232196010" w:history="1">
+      <w:hyperlink w:anchor="_Toc232196156" w:history="1">
         <w:r>
           <w:rPr>
             <w:rStyle w:val="Hyperlink"/>
@@ -6842,7 +6842,7 @@
             <w:noProof/>
             <w:webHidden/>
           </w:rPr>
-          <w:instrText xml:space="preserve"> PAGEREF _Toc232196010 \h </w:instrText>
+          <w:instrText xml:space="preserve"> PAGEREF _Toc232196156 \h </w:instrText>
         </w:r>
         <w:r>
           <w:rPr>
@@ -6888,7 +6888,7 @@
           <w14:ligatures w14:val="standardContextual"/>
         </w:rPr>
       </w:pPr>
-      <w:hyperlink w:anchor="_Toc232196011" w:history="1">
+      <w:hyperlink w:anchor="_Toc232196157" w:history="1">
         <w:r>
           <w:rPr>
             <w:rStyle w:val="Hyperlink"/>
@@ -6915,7 +6915,7 @@
             <w:noProof/>
             <w:webHidden/>
           </w:rPr>
-          <w:instrText xml:space="preserve"> PAGEREF _Toc232196011 \h </w:instrText>
+          <w:instrText xml:space="preserve"> PAGEREF _Toc232196157 \h </w:instrText>
         </w:r>
         <w:r>
           <w:rPr>
@@ -6961,7 +6961,7 @@
           <w14:ligatures w14:val="standardContextual"/>
         </w:rPr>
       </w:pPr>
-      <w:hyperlink w:anchor="_Toc232196012" w:history="1">
+      <w:hyperlink w:anchor="_Toc232196158" w:history="1">
         <w:r>
           <w:rPr>
             <w:rStyle w:val="Hyperlink"/>
@@ -6988,7 +6988,7 @@
             <w:noProof/>
             <w:webHidden/>
           </w:rPr>
-          <w:instrText xml:space="preserve"> PAGEREF _Toc232196012 \h </w:instrText>
+          <w:instrText xml:space="preserve"> PAGEREF _Toc232196158 \h </w:instrText>
         </w:r>
         <w:r>
           <w:rPr>
@@ -7034,7 +7034,7 @@
           <w14:ligatures w14:val="standardContextual"/>
         </w:rPr>
       </w:pPr>
-      <w:hyperlink w:anchor="_Toc232196013" w:history="1">
+      <w:hyperlink w:anchor="_Toc232196159" w:history="1">
         <w:r>
           <w:rPr>
             <w:rStyle w:val="Hyperlink"/>
@@ -7061,7 +7061,7 @@
             <w:noProof/>
             <w:webHidden/>
           </w:rPr>
-          <w:instrText xml:space="preserve"> PAGEREF _Toc232196013 \h </w:instrText>
+          <w:instrText xml:space="preserve"> PAGEREF _Toc232196159 \h </w:instrText>
         </w:r>
         <w:r>
           <w:rPr>
@@ -7107,7 +7107,7 @@
           <w14:ligatures w14:val="standardContextual"/>
         </w:rPr>
       </w:pPr>
-      <w:hyperlink w:anchor="_Toc232196014" w:history="1">
+      <w:hyperlink w:anchor="_Toc232196160" w:history="1">
         <w:r>
           <w:rPr>
             <w:rStyle w:val="Hyperlink"/>
@@ -7134,7 +7134,7 @@
             <w:noProof/>
             <w:webHidden/>
           </w:rPr>
-          <w:instrText xml:space="preserve"> PAGEREF _Toc232196014 \h </w:instrText>
+          <w:instrText xml:space="preserve"> PAGEREF _Toc232196160 \h </w:instrText>
         </w:r>
         <w:r>
           <w:rPr>
@@ -7180,7 +7180,7 @@
           <w14:ligatures w14:val="standardContextual"/>
         </w:rPr>
       </w:pPr>
-      <w:hyperlink w:anchor="_Toc232196015" w:history="1">
+      <w:hyperlink w:anchor="_Toc232196161" w:history="1">
         <w:r>
           <w:rPr>
             <w:rStyle w:val="Hyperlink"/>
@@ -7207,7 +7207,7 @@
             <w:noProof/>
             <w:webHidden/>
           </w:rPr>
-          <w:instrText xml:space="preserve"> PAGEREF _Toc232196015 \h </w:instrText>
+          <w:instrText xml:space="preserve"> PAGEREF _Toc232196161 \h </w:instrText>
         </w:r>
         <w:r>
           <w:rPr>
@@ -7253,7 +7253,7 @@
           <w14:ligatures w14:val="standardContextual"/>
         </w:rPr>
       </w:pPr>
-      <w:hyperlink w:anchor="_Toc232196016" w:history="1">
+      <w:hyperlink w:anchor="_Toc232196162" w:history="1">
         <w:r>
           <w:rPr>
             <w:rStyle w:val="Hyperlink"/>
@@ -7280,7 +7280,7 @@
             <w:noProof/>
             <w:webHidden/>
           </w:rPr>
-          <w:instrText xml:space="preserve"> PAGEREF _Toc232196016 \h </w:instrText>
+          <w:instrText xml:space="preserve"> PAGEREF _Toc232196162 \h </w:instrText>
         </w:r>
         <w:r>
           <w:rPr>
@@ -7326,7 +7326,7 @@
           <w14:ligatures w14:val="standardContextual"/>
         </w:rPr>
       </w:pPr>
-      <w:hyperlink w:anchor="_Toc232196017" w:history="1">
+      <w:hyperlink w:anchor="_Toc232196163" w:history="1">
         <w:r>
           <w:rPr>
             <w:rStyle w:val="Hyperlink"/>
@@ -7353,7 +7353,7 @@
             <w:noProof/>
             <w:webHidden/>
           </w:rPr>
-          <w:instrText xml:space="preserve"> PAGEREF _Toc232196017 \h </w:instrText>
+          <w:instrText xml:space="preserve"> PAGEREF _Toc232196163 \h </w:instrText>
         </w:r>
         <w:r>
           <w:rPr>
@@ -7401,7 +7401,7 @@
       <w:pPr>
         <w:pStyle w:val="Heading1"/>
       </w:pPr>
-      <w:bookmarkStart w:id="4" w:name="_Toc232195936"/>
+      <w:bookmarkStart w:id="4" w:name="_Toc232196082"/>
       <w:r>
         <w:rPr>
           <w:rFonts w:ascii="Times New Roman" w:eastAsia="Times New Roman" w:hAnsi="Times New Roman"/>
@@ -7434,7 +7434,7 @@
       <w:r>
         <w:fldChar w:fldCharType="separate"/>
       </w:r>
-      <w:hyperlink w:anchor="_Toc232196018" w:history="1">
+      <w:hyperlink w:anchor="_Toc232196164" w:history="1">
         <w:r>
           <w:rPr>
             <w:rStyle w:val="Hyperlink"/>
@@ -7461,7 +7461,7 @@
             <w:noProof/>
             <w:webHidden/>
           </w:rPr>
-          <w:instrText xml:space="preserve"> PAGEREF _Toc232196018 \h </w:instrText>
+          <w:instrText xml:space="preserve"> PAGEREF _Toc232196164 \h </w:instrText>
         </w:r>
         <w:r>
           <w:rPr>
@@ -7507,7 +7507,7 @@
           <w14:ligatures w14:val="standardContextual"/>
         </w:rPr>
       </w:pPr>
-      <w:hyperlink w:anchor="_Toc232196019" w:history="1">
+      <w:hyperlink w:anchor="_Toc232196165" w:history="1">
         <w:r>
           <w:rPr>
             <w:rStyle w:val="Hyperlink"/>
@@ -7534,7 +7534,7 @@
             <w:noProof/>
             <w:webHidden/>
           </w:rPr>
-          <w:instrText xml:space="preserve"> PAGEREF _Toc232196019 \h </w:instrText>
+          <w:instrText xml:space="preserve"> PAGEREF _Toc232196165 \h </w:instrText>
         </w:r>
         <w:r>
           <w:rPr>
@@ -7580,7 +7580,7 @@
           <w14:ligatures w14:val="standardContextual"/>
         </w:rPr>
       </w:pPr>
-      <w:hyperlink w:anchor="_Toc232196020" w:history="1">
+      <w:hyperlink w:anchor="_Toc232196166" w:history="1">
         <w:r>
           <w:rPr>
             <w:rStyle w:val="Hyperlink"/>
@@ -7607,7 +7607,7 @@
             <w:noProof/>
             <w:webHidden/>
           </w:rPr>
-          <w:instrText xml:space="preserve"> PAGEREF _Toc232196020 \h </w:instrText>
+          <w:instrText xml:space="preserve"> PAGEREF _Toc232196166 \h </w:instrText>
         </w:r>
         <w:r>
           <w:rPr>
@@ -7653,7 +7653,7 @@
           <w14:ligatures w14:val="standardContextual"/>
         </w:rPr>
       </w:pPr>
-      <w:hyperlink w:anchor="_Toc232196021" w:history="1">
+      <w:hyperlink w:anchor="_Toc232196167" w:history="1">
         <w:r>
           <w:rPr>
             <w:rStyle w:val="Hyperlink"/>
@@ -7680,7 +7680,7 @@
             <w:noProof/>
             <w:webHidden/>
           </w:rPr>
-          <w:instrText xml:space="preserve"> PAGEREF _Toc232196021 \h </w:instrText>
+          <w:instrText xml:space="preserve"> PAGEREF _Toc232196167 \h </w:instrText>
         </w:r>
         <w:r>
           <w:rPr>
@@ -7726,7 +7726,7 @@
           <w14:ligatures w14:val="standardContextual"/>
         </w:rPr>
       </w:pPr>
-      <w:hyperlink w:anchor="_Toc232196022" w:history="1">
+      <w:hyperlink w:anchor="_Toc232196168" w:history="1">
         <w:r>
           <w:rPr>
             <w:rStyle w:val="Hyperlink"/>
@@ -7753,7 +7753,7 @@
             <w:noProof/>
             <w:webHidden/>
           </w:rPr>
-          <w:instrText xml:space="preserve"> PAGEREF _Toc232196022 \h </w:instrText>
+          <w:instrText xml:space="preserve"> PAGEREF _Toc232196168 \h </w:instrText>
         </w:r>
         <w:r>
           <w:rPr>
@@ -7799,7 +7799,7 @@
           <w14:ligatures w14:val="standardContextual"/>
         </w:rPr>
       </w:pPr>
-      <w:hyperlink w:anchor="_Toc232196023" w:history="1">
+      <w:hyperlink w:anchor="_Toc232196169" w:history="1">
         <w:r>
           <w:rPr>
             <w:rStyle w:val="Hyperlink"/>
@@ -7826,7 +7826,7 @@
             <w:noProof/>
             <w:webHidden/>
           </w:rPr>
-          <w:instrText xml:space="preserve"> PAGEREF _Toc232196023 \h </w:instrText>
+          <w:instrText xml:space="preserve"> PAGEREF _Toc232196169 \h </w:instrText>
         </w:r>
         <w:r>
           <w:rPr>
@@ -7872,7 +7872,7 @@
           <w14:ligatures w14:val="standardContextual"/>
         </w:rPr>
       </w:pPr>
-      <w:hyperlink w:anchor="_Toc232196024" w:history="1">
+      <w:hyperlink w:anchor="_Toc232196170" w:history="1">
         <w:r>
           <w:rPr>
             <w:rStyle w:val="Hyperlink"/>
@@ -7899,7 +7899,7 @@
             <w:noProof/>
             <w:webHidden/>
           </w:rPr>
-          <w:instrText xml:space="preserve"> PAGEREF _Toc232196024 \h </w:instrText>
+          <w:instrText xml:space="preserve"> PAGEREF _Toc232196170 \h </w:instrText>
         </w:r>
         <w:r>
           <w:rPr>
@@ -7945,7 +7945,7 @@
           <w14:ligatures w14:val="standardContextual"/>
         </w:rPr>
       </w:pPr>
-      <w:hyperlink w:anchor="_Toc232196025" w:history="1">
+      <w:hyperlink w:anchor="_Toc232196171" w:history="1">
         <w:r>
           <w:rPr>
             <w:rStyle w:val="Hyperlink"/>
@@ -7972,7 +7972,7 @@
             <w:noProof/>
             <w:webHidden/>
           </w:rPr>
-          <w:instrText xml:space="preserve"> PAGEREF _Toc232196025 \h </w:instrText>
+          <w:instrText xml:space="preserve"> PAGEREF _Toc232196171 \h </w:instrText>
         </w:r>
         <w:r>
           <w:rPr>
@@ -8018,7 +8018,7 @@
           <w14:ligatures w14:val="standardContextual"/>
         </w:rPr>
       </w:pPr>
-      <w:hyperlink w:anchor="_Toc232196026" w:history="1">
+      <w:hyperlink w:anchor="_Toc232196172" w:history="1">
         <w:r>
           <w:rPr>
             <w:rStyle w:val="Hyperlink"/>
@@ -8045,7 +8045,7 @@
             <w:noProof/>
             <w:webHidden/>
           </w:rPr>
-          <w:instrText xml:space="preserve"> PAGEREF _Toc232196026 \h </w:instrText>
+          <w:instrText xml:space="preserve"> PAGEREF _Toc232196172 \h </w:instrText>
         </w:r>
         <w:r>
           <w:rPr>
@@ -8091,7 +8091,7 @@
           <w14:ligatures w14:val="standardContextual"/>
         </w:rPr>
       </w:pPr>
-      <w:hyperlink w:anchor="_Toc232196027" w:history="1">
+      <w:hyperlink w:anchor="_Toc232196173" w:history="1">
         <w:r>
           <w:rPr>
             <w:rStyle w:val="Hyperlink"/>
@@ -8118,7 +8118,7 @@
             <w:noProof/>
             <w:webHidden/>
           </w:rPr>
-          <w:instrText xml:space="preserve"> PAGEREF _Toc232196027 \h </w:instrText>
+          <w:instrText xml:space="preserve"> PAGEREF _Toc232196173 \h </w:instrText>
         </w:r>
         <w:r>
           <w:rPr>
@@ -8164,7 +8164,7 @@
           <w14:ligatures w14:val="standardContextual"/>
         </w:rPr>
       </w:pPr>
-      <w:hyperlink w:anchor="_Toc232196028" w:history="1">
+      <w:hyperlink w:anchor="_Toc232196174" w:history="1">
         <w:r>
           <w:rPr>
             <w:rStyle w:val="Hyperlink"/>
@@ -8191,7 +8191,7 @@
             <w:noProof/>
             <w:webHidden/>
           </w:rPr>
-          <w:instrText xml:space="preserve"> PAGEREF _Toc232196028 \h </w:instrText>
+          <w:instrText xml:space="preserve"> PAGEREF _Toc232196174 \h </w:instrText>
         </w:r>
         <w:r>
           <w:rPr>
@@ -8237,7 +8237,7 @@
           <w14:ligatures w14:val="standardContextual"/>
         </w:rPr>
       </w:pPr>
-      <w:hyperlink w:anchor="_Toc232196029" w:history="1">
+      <w:hyperlink w:anchor="_Toc232196175" w:history="1">
         <w:r>
           <w:rPr>
             <w:rStyle w:val="Hyperlink"/>
@@ -8264,7 +8264,7 @@
             <w:noProof/>
             <w:webHidden/>
           </w:rPr>
-          <w:instrText xml:space="preserve"> PAGEREF _Toc232196029 \h </w:instrText>
+          <w:instrText xml:space="preserve"> PAGEREF _Toc232196175 \h </w:instrText>
         </w:r>
         <w:r>
           <w:rPr>
@@ -8310,7 +8310,7 @@
           <w14:ligatures w14:val="standardContextual"/>
         </w:rPr>
       </w:pPr>
-      <w:hyperlink w:anchor="_Toc232196030" w:history="1">
+      <w:hyperlink w:anchor="_Toc232196176" w:history="1">
         <w:r>
           <w:rPr>
             <w:rStyle w:val="Hyperlink"/>
@@ -8337,7 +8337,7 @@
             <w:noProof/>
             <w:webHidden/>
           </w:rPr>
-          <w:instrText xml:space="preserve"> PAGEREF _Toc232196030 \h </w:instrText>
+          <w:instrText xml:space="preserve"> PAGEREF _Toc232196176 \h </w:instrText>
         </w:r>
         <w:r>
           <w:rPr>
@@ -8383,7 +8383,7 @@
           <w14:ligatures w14:val="standardContextual"/>
         </w:rPr>
       </w:pPr>
-      <w:hyperlink w:anchor="_Toc232196031" w:history="1">
+      <w:hyperlink w:anchor="_Toc232196177" w:history="1">
         <w:r>
           <w:rPr>
             <w:rStyle w:val="Hyperlink"/>
@@ -8410,7 +8410,7 @@
             <w:noProof/>
             <w:webHidden/>
           </w:rPr>
-          <w:instrText xml:space="preserve"> PAGEREF _Toc232196031 \h </w:instrText>
+          <w:instrText xml:space="preserve"> PAGEREF _Toc232196177 \h </w:instrText>
         </w:r>
         <w:r>
           <w:rPr>
@@ -8456,7 +8456,7 @@
           <w14:ligatures w14:val="standardContextual"/>
         </w:rPr>
       </w:pPr>
-      <w:hyperlink w:anchor="_Toc232196032" w:history="1">
+      <w:hyperlink w:anchor="_Toc232196178" w:history="1">
         <w:r>
           <w:rPr>
             <w:rStyle w:val="Hyperlink"/>
@@ -8483,7 +8483,7 @@
             <w:noProof/>
             <w:webHidden/>
           </w:rPr>
-          <w:instrText xml:space="preserve"> PAGEREF _Toc232196032 \h </w:instrText>
+          <w:instrText xml:space="preserve"> PAGEREF _Toc232196178 \h </w:instrText>
         </w:r>
         <w:r>
           <w:rPr>
@@ -8531,7 +8531,7 @@
       <w:pPr>
         <w:pStyle w:val="Heading1"/>
       </w:pPr>
-      <w:bookmarkStart w:id="5" w:name="_Toc232195937"/>
+      <w:bookmarkStart w:id="5" w:name="_Toc232196083"/>
       <w:r>
         <w:rPr>
           <w:rFonts w:ascii="Times New Roman" w:eastAsia="Times New Roman" w:hAnsi="Times New Roman"/>
@@ -8545,7 +8545,7 @@
         <w:pStyle w:val="TableCaption"/>
         <w:keepNext/>
       </w:pPr>
-      <w:bookmarkStart w:id="6" w:name="_Toc232196018"/>
+      <w:bookmarkStart w:id="6" w:name="_Toc232196164"/>
       <w:r>
         <w:t>Bảng 0.1. Danh mục từ viết tắt</w:t>
       </w:r>
@@ -9283,7 +9283,7 @@
       <w:pPr>
         <w:pStyle w:val="Heading1"/>
       </w:pPr>
-      <w:bookmarkStart w:id="7" w:name="_Toc232195938"/>
+      <w:bookmarkStart w:id="7" w:name="_Toc232196084"/>
       <w:r>
         <w:rPr>
           <w:rFonts w:ascii="Times New Roman" w:eastAsia="Times New Roman" w:hAnsi="Times New Roman"/>
@@ -9296,7 +9296,7 @@
       <w:pPr>
         <w:pStyle w:val="Heading2"/>
       </w:pPr>
-      <w:bookmarkStart w:id="8" w:name="_Toc232195939"/>
+      <w:bookmarkStart w:id="8" w:name="_Toc232196085"/>
       <w:r>
         <w:rPr>
           <w:rFonts w:ascii="Times New Roman" w:eastAsia="Times New Roman" w:hAnsi="Times New Roman"/>
@@ -9324,7 +9324,7 @@
       <w:pPr>
         <w:pStyle w:val="Heading2"/>
       </w:pPr>
-      <w:bookmarkStart w:id="9" w:name="_Toc232195940"/>
+      <w:bookmarkStart w:id="9" w:name="_Toc232196086"/>
       <w:r>
         <w:rPr>
           <w:rFonts w:ascii="Times New Roman" w:eastAsia="Times New Roman" w:hAnsi="Times New Roman"/>
@@ -9398,7 +9398,7 @@
       <w:pPr>
         <w:pStyle w:val="Heading2"/>
       </w:pPr>
-      <w:bookmarkStart w:id="10" w:name="_Toc232195941"/>
+      <w:bookmarkStart w:id="10" w:name="_Toc232196087"/>
       <w:r>
         <w:rPr>
           <w:rFonts w:ascii="Times New Roman" w:eastAsia="Times New Roman" w:hAnsi="Times New Roman"/>
@@ -9421,7 +9421,7 @@
       <w:pPr>
         <w:pStyle w:val="Heading2"/>
       </w:pPr>
-      <w:bookmarkStart w:id="11" w:name="_Toc232195942"/>
+      <w:bookmarkStart w:id="11" w:name="_Toc232196088"/>
       <w:r>
         <w:rPr>
           <w:rFonts w:ascii="Times New Roman" w:eastAsia="Times New Roman" w:hAnsi="Times New Roman"/>
@@ -9474,7 +9474,7 @@
       <w:pPr>
         <w:pStyle w:val="Heading2"/>
       </w:pPr>
-      <w:bookmarkStart w:id="12" w:name="_Toc232195943"/>
+      <w:bookmarkStart w:id="12" w:name="_Toc232196089"/>
       <w:r>
         <w:rPr>
           <w:rFonts w:ascii="Times New Roman" w:eastAsia="Times New Roman" w:hAnsi="Times New Roman"/>
@@ -9488,7 +9488,7 @@
         <w:pStyle w:val="TableCaption"/>
         <w:keepNext/>
       </w:pPr>
-      <w:bookmarkStart w:id="13" w:name="_Toc232196019"/>
+      <w:bookmarkStart w:id="13" w:name="_Toc232196165"/>
       <w:r>
         <w:t>Bảng 0.2. Kế hoạch thực hiện đề tài</w:t>
       </w:r>
@@ -9909,7 +9909,7 @@
       <w:pPr>
         <w:pStyle w:val="Heading2"/>
       </w:pPr>
-      <w:bookmarkStart w:id="14" w:name="_Toc232195944"/>
+      <w:bookmarkStart w:id="14" w:name="_Toc232196090"/>
       <w:r>
         <w:rPr>
           <w:rFonts w:ascii="Times New Roman" w:eastAsia="Times New Roman" w:hAnsi="Times New Roman"/>
@@ -9932,7 +9932,7 @@
       <w:pPr>
         <w:pStyle w:val="Heading1"/>
       </w:pPr>
-      <w:bookmarkStart w:id="15" w:name="_Toc232195945"/>
+      <w:bookmarkStart w:id="15" w:name="_Toc232196091"/>
       <w:r>
         <w:rPr>
           <w:rFonts w:ascii="Times New Roman" w:eastAsia="Times New Roman" w:hAnsi="Times New Roman"/>
@@ -9945,7 +9945,7 @@
       <w:pPr>
         <w:pStyle w:val="Heading2"/>
       </w:pPr>
-      <w:bookmarkStart w:id="16" w:name="_Toc232195946"/>
+      <w:bookmarkStart w:id="16" w:name="_Toc232196092"/>
       <w:r>
         <w:rPr>
           <w:rFonts w:ascii="Times New Roman" w:eastAsia="Times New Roman" w:hAnsi="Times New Roman"/>
@@ -9968,7 +9968,7 @@
       <w:pPr>
         <w:pStyle w:val="Heading2"/>
       </w:pPr>
-      <w:bookmarkStart w:id="17" w:name="_Toc232195947"/>
+      <w:bookmarkStart w:id="17" w:name="_Toc232196093"/>
       <w:r>
         <w:rPr>
           <w:rFonts w:ascii="Times New Roman" w:eastAsia="Times New Roman" w:hAnsi="Times New Roman"/>
@@ -9991,7 +9991,7 @@
       <w:pPr>
         <w:pStyle w:val="Heading2"/>
       </w:pPr>
-      <w:bookmarkStart w:id="18" w:name="_Toc232195948"/>
+      <w:bookmarkStart w:id="18" w:name="_Toc232196094"/>
       <w:r>
         <w:rPr>
           <w:rFonts w:ascii="Times New Roman" w:eastAsia="Times New Roman" w:hAnsi="Times New Roman"/>
@@ -10052,7 +10052,7 @@
       <w:pPr>
         <w:pStyle w:val="Heading2"/>
       </w:pPr>
-      <w:bookmarkStart w:id="19" w:name="_Toc232195949"/>
+      <w:bookmarkStart w:id="19" w:name="_Toc232196095"/>
       <w:r>
         <w:rPr>
           <w:rFonts w:ascii="Times New Roman" w:eastAsia="Times New Roman" w:hAnsi="Times New Roman"/>
@@ -10125,7 +10125,7 @@
       <w:pPr>
         <w:pStyle w:val="Heading2"/>
       </w:pPr>
-      <w:bookmarkStart w:id="20" w:name="_Toc232195950"/>
+      <w:bookmarkStart w:id="20" w:name="_Toc232196096"/>
       <w:r>
         <w:rPr>
           <w:rFonts w:ascii="Times New Roman" w:eastAsia="Times New Roman" w:hAnsi="Times New Roman"/>
@@ -10148,7 +10148,7 @@
       <w:pPr>
         <w:pStyle w:val="Heading2"/>
       </w:pPr>
-      <w:bookmarkStart w:id="21" w:name="_Toc232195951"/>
+      <w:bookmarkStart w:id="21" w:name="_Toc232196097"/>
       <w:r>
         <w:rPr>
           <w:rFonts w:ascii="Times New Roman" w:eastAsia="Times New Roman" w:hAnsi="Times New Roman"/>
@@ -10162,7 +10162,7 @@
         <w:pStyle w:val="TableCaption"/>
         <w:keepNext/>
       </w:pPr>
-      <w:bookmarkStart w:id="22" w:name="_Toc232196020"/>
+      <w:bookmarkStart w:id="22" w:name="_Toc232196166"/>
       <w:r>
         <w:t>Bảng 1.1. Tổng hợp chức năng chính của StellarMind</w:t>
       </w:r>
@@ -10766,7 +10766,7 @@
       <w:pPr>
         <w:pStyle w:val="Heading2"/>
       </w:pPr>
-      <w:bookmarkStart w:id="23" w:name="_Toc232195952"/>
+      <w:bookmarkStart w:id="23" w:name="_Toc232196098"/>
       <w:r>
         <w:rPr>
           <w:rFonts w:ascii="Times New Roman" w:eastAsia="Times New Roman" w:hAnsi="Times New Roman"/>
@@ -10785,7 +10785,7 @@
         <w:pStyle w:val="TableCaption"/>
         <w:keepNext/>
       </w:pPr>
-      <w:bookmarkStart w:id="24" w:name="_Toc232196021"/>
+      <w:bookmarkStart w:id="24" w:name="_Toc232196167"/>
       <w:r>
         <w:t>Bảng 1.2. Công nghệ và vai trò trong dự án</w:t>
       </w:r>
@@ -11421,7 +11421,7 @@
       <w:pPr>
         <w:pStyle w:val="Heading2"/>
       </w:pPr>
-      <w:bookmarkStart w:id="25" w:name="_Toc232195953"/>
+      <w:bookmarkStart w:id="25" w:name="_Toc232196099"/>
       <w:r>
         <w:rPr>
           <w:rFonts w:ascii="Times New Roman" w:eastAsia="Times New Roman" w:hAnsi="Times New Roman"/>
@@ -11444,7 +11444,7 @@
       <w:pPr>
         <w:pStyle w:val="Heading1"/>
       </w:pPr>
-      <w:bookmarkStart w:id="26" w:name="_Toc232195954"/>
+      <w:bookmarkStart w:id="26" w:name="_Toc232196100"/>
       <w:r>
         <w:rPr>
           <w:rFonts w:ascii="Times New Roman" w:eastAsia="Times New Roman" w:hAnsi="Times New Roman"/>
@@ -11457,7 +11457,7 @@
       <w:pPr>
         <w:pStyle w:val="Heading2"/>
       </w:pPr>
-      <w:bookmarkStart w:id="27" w:name="_Toc232195955"/>
+      <w:bookmarkStart w:id="27" w:name="_Toc232196101"/>
       <w:r>
         <w:rPr>
           <w:rFonts w:ascii="Times New Roman" w:eastAsia="Times New Roman" w:hAnsi="Times New Roman"/>
@@ -11480,7 +11480,7 @@
       <w:pPr>
         <w:pStyle w:val="Heading2"/>
       </w:pPr>
-      <w:bookmarkStart w:id="28" w:name="_Toc232195956"/>
+      <w:bookmarkStart w:id="28" w:name="_Toc232196102"/>
       <w:r>
         <w:rPr>
           <w:rFonts w:ascii="Times New Roman" w:eastAsia="Times New Roman" w:hAnsi="Times New Roman"/>
@@ -11494,7 +11494,7 @@
         <w:pStyle w:val="TableCaption"/>
         <w:keepNext/>
       </w:pPr>
-      <w:bookmarkStart w:id="29" w:name="_Toc232196022"/>
+      <w:bookmarkStart w:id="29" w:name="_Toc232196168"/>
       <w:r>
         <w:t>Bảng 2.1. Các tác nhân của hệ thống</w:t>
       </w:r>
@@ -11794,7 +11794,7 @@
       <w:pPr>
         <w:pStyle w:val="Heading2"/>
       </w:pPr>
-      <w:bookmarkStart w:id="30" w:name="_Toc232195957"/>
+      <w:bookmarkStart w:id="30" w:name="_Toc232196103"/>
       <w:r>
         <w:rPr>
           <w:rFonts w:ascii="Times New Roman" w:eastAsia="Times New Roman" w:hAnsi="Times New Roman"/>
@@ -11808,7 +11808,7 @@
         <w:pStyle w:val="TableCaption"/>
         <w:keepNext/>
       </w:pPr>
-      <w:bookmarkStart w:id="31" w:name="_Toc232196023"/>
+      <w:bookmarkStart w:id="31" w:name="_Toc232196169"/>
       <w:r>
         <w:t>Bảng 2.2. Yêu cầu chức năng</w:t>
       </w:r>
@@ -12620,7 +12620,7 @@
               <w:rPr>
                 <w:sz w:val="21"/>
               </w:rPr>
-              <w:t>Trang liên hệ có thể liên kết email tài khoản, kiểm tra dữ liệu và gửi thư khi SMTP được cấu hình.</w:t>
+              <w:t>Gửi liên hệ qua backend khi đã đăng nhập, có email và SMTP được cấu hình.</w:t>
             </w:r>
           </w:p>
         </w:tc>
@@ -12654,7 +12654,7 @@
       <w:pPr>
         <w:pStyle w:val="Heading2"/>
       </w:pPr>
-      <w:bookmarkStart w:id="32" w:name="_Toc232195958"/>
+      <w:bookmarkStart w:id="32" w:name="_Toc232196104"/>
       <w:r>
         <w:rPr>
           <w:rFonts w:ascii="Times New Roman" w:eastAsia="Times New Roman" w:hAnsi="Times New Roman"/>
@@ -12668,7 +12668,7 @@
         <w:pStyle w:val="TableCaption"/>
         <w:keepNext/>
       </w:pPr>
-      <w:bookmarkStart w:id="33" w:name="_Toc232196024"/>
+      <w:bookmarkStart w:id="33" w:name="_Toc232196170"/>
       <w:r>
         <w:t>Bảng 2.3. Yêu cầu phi chức năng</w:t>
       </w:r>
@@ -13210,7 +13210,7 @@
       <w:pPr>
         <w:pStyle w:val="Heading2"/>
       </w:pPr>
-      <w:bookmarkStart w:id="34" w:name="_Toc232195959"/>
+      <w:bookmarkStart w:id="34" w:name="_Toc232196105"/>
       <w:r>
         <w:rPr>
           <w:rFonts w:ascii="Times New Roman" w:eastAsia="Times New Roman" w:hAnsi="Times New Roman"/>
@@ -13239,7 +13239,7 @@
           <w:noProof/>
         </w:rPr>
         <w:drawing>
-          <wp:inline distT="0" distB="0" distL="0" distR="0" wp14:anchorId="6F378837" wp14:editId="40718AC2">
+          <wp:inline distT="0" distB="0" distL="0" distR="0" wp14:anchorId="74154A3D" wp14:editId="6FCDFEDE">
             <wp:extent cx="5577840" cy="3408680"/>
             <wp:effectExtent l="0" t="0" r="0" b="0"/>
             <wp:docPr id="3" name="Picture 3" descr="Hình 2.1. Biểu đồ Use Case tổng quát của StellarMind" title="Hình 2.1. Biểu đồ Use Case tổng quát của StellarMind"/>
@@ -13279,7 +13279,7 @@
       <w:pPr>
         <w:pStyle w:val="FigureCaption"/>
       </w:pPr>
-      <w:bookmarkStart w:id="35" w:name="_Toc232196002"/>
+      <w:bookmarkStart w:id="35" w:name="_Toc232196148"/>
       <w:r>
         <w:t>Hình 2.1. Biểu đồ Use Case tổng quát của StellarMind</w:t>
       </w:r>
@@ -13294,7 +13294,7 @@
       <w:pPr>
         <w:pStyle w:val="Heading2"/>
       </w:pPr>
-      <w:bookmarkStart w:id="36" w:name="_Toc232195960"/>
+      <w:bookmarkStart w:id="36" w:name="_Toc232196106"/>
       <w:r>
         <w:rPr>
           <w:rFonts w:ascii="Times New Roman" w:eastAsia="Times New Roman" w:hAnsi="Times New Roman"/>
@@ -13308,7 +13308,7 @@
         <w:pStyle w:val="TableCaption"/>
         <w:keepNext/>
       </w:pPr>
-      <w:bookmarkStart w:id="37" w:name="_Toc232196025"/>
+      <w:bookmarkStart w:id="37" w:name="_Toc232196171"/>
       <w:r>
         <w:t>Bảng 2.4. Mô tả tóm tắt các Use Case</w:t>
       </w:r>
@@ -14324,7 +14324,7 @@
       <w:pPr>
         <w:pStyle w:val="Heading2"/>
       </w:pPr>
-      <w:bookmarkStart w:id="38" w:name="_Toc232195961"/>
+      <w:bookmarkStart w:id="38" w:name="_Toc232196107"/>
       <w:r>
         <w:rPr>
           <w:rFonts w:ascii="Times New Roman" w:eastAsia="Times New Roman" w:hAnsi="Times New Roman"/>
@@ -14353,7 +14353,7 @@
           <w:noProof/>
         </w:rPr>
         <w:drawing>
-          <wp:inline distT="0" distB="0" distL="0" distR="0" wp14:anchorId="5EE51A27" wp14:editId="162936AB">
+          <wp:inline distT="0" distB="0" distL="0" distR="0" wp14:anchorId="4CB77C77" wp14:editId="362EB7C6">
             <wp:extent cx="5577840" cy="3408680"/>
             <wp:effectExtent l="0" t="0" r="0" b="0"/>
             <wp:docPr id="4" name="Picture 4" descr="Hình 2.2. Kiến trúc tổng thể của hệ thống" title="Hình 2.2. Kiến trúc tổng thể của hệ thống"/>
@@ -14393,7 +14393,7 @@
       <w:pPr>
         <w:pStyle w:val="FigureCaption"/>
       </w:pPr>
-      <w:bookmarkStart w:id="39" w:name="_Toc232196003"/>
+      <w:bookmarkStart w:id="39" w:name="_Toc232196149"/>
       <w:r>
         <w:t>Hình 2.2. Kiến trúc tổng thể của hệ thống</w:t>
       </w:r>
@@ -14408,7 +14408,7 @@
       <w:pPr>
         <w:pStyle w:val="Heading2"/>
       </w:pPr>
-      <w:bookmarkStart w:id="40" w:name="_Toc232195962"/>
+      <w:bookmarkStart w:id="40" w:name="_Toc232196108"/>
       <w:r>
         <w:rPr>
           <w:rFonts w:ascii="Times New Roman" w:eastAsia="Times New Roman" w:hAnsi="Times New Roman"/>
@@ -14427,7 +14427,7 @@
         <w:pStyle w:val="TableCaption"/>
         <w:keepNext/>
       </w:pPr>
-      <w:bookmarkStart w:id="41" w:name="_Toc232196026"/>
+      <w:bookmarkStart w:id="41" w:name="_Toc232196172"/>
       <w:r>
         <w:t>Bảng 2.5. Thiết kế collection User</w:t>
       </w:r>
@@ -14790,7 +14790,7 @@
         <w:pStyle w:val="TableCaption"/>
         <w:keepNext/>
       </w:pPr>
-      <w:bookmarkStart w:id="42" w:name="_Toc232196027"/>
+      <w:bookmarkStart w:id="42" w:name="_Toc232196173"/>
       <w:r>
         <w:t>Bảng 2.6. Thiết kế collection Comment</w:t>
       </w:r>
@@ -15516,7 +15516,7 @@
         <w:pStyle w:val="TableCaption"/>
         <w:keepNext/>
       </w:pPr>
-      <w:bookmarkStart w:id="43" w:name="_Toc232196028"/>
+      <w:bookmarkStart w:id="43" w:name="_Toc232196174"/>
       <w:r>
         <w:t>Bảng 2.7. Thiết kế subdocument Reply</w:t>
       </w:r>
@@ -15937,7 +15937,7 @@
       <w:pPr>
         <w:pStyle w:val="Heading2"/>
       </w:pPr>
-      <w:bookmarkStart w:id="44" w:name="_Toc232195963"/>
+      <w:bookmarkStart w:id="44" w:name="_Toc232196109"/>
       <w:r>
         <w:rPr>
           <w:rFonts w:ascii="Times New Roman" w:eastAsia="Times New Roman" w:hAnsi="Times New Roman"/>
@@ -15958,7 +15958,7 @@
           <w:noProof/>
         </w:rPr>
         <w:drawing>
-          <wp:inline distT="0" distB="0" distL="0" distR="0" wp14:anchorId="4622F232" wp14:editId="45B24B38">
+          <wp:inline distT="0" distB="0" distL="0" distR="0" wp14:anchorId="394CF8E7" wp14:editId="58F584D1">
             <wp:extent cx="5577840" cy="3408680"/>
             <wp:effectExtent l="0" t="0" r="0" b="0"/>
             <wp:docPr id="5" name="Picture 5" descr="Hình 2.3. Mô hình dữ liệu User, Comment và Reply" title="Hình 2.3. Mô hình dữ liệu User, Comment và Reply"/>
@@ -15998,7 +15998,7 @@
       <w:pPr>
         <w:pStyle w:val="FigureCaption"/>
       </w:pPr>
-      <w:bookmarkStart w:id="45" w:name="_Toc232196004"/>
+      <w:bookmarkStart w:id="45" w:name="_Toc232196150"/>
       <w:r>
         <w:t>Hình 2.3. Mô hình dữ liệu User, Comment và Reply</w:t>
       </w:r>
@@ -16013,7 +16013,7 @@
       <w:pPr>
         <w:pStyle w:val="Heading2"/>
       </w:pPr>
-      <w:bookmarkStart w:id="46" w:name="_Toc232195964"/>
+      <w:bookmarkStart w:id="46" w:name="_Toc232196110"/>
       <w:r>
         <w:rPr>
           <w:rFonts w:ascii="Times New Roman" w:eastAsia="Times New Roman" w:hAnsi="Times New Roman"/>
@@ -16026,7 +16026,7 @@
       <w:pPr>
         <w:pStyle w:val="Heading3"/>
       </w:pPr>
-      <w:bookmarkStart w:id="47" w:name="_Toc232195965"/>
+      <w:bookmarkStart w:id="47" w:name="_Toc232196111"/>
       <w:r>
         <w:rPr>
           <w:rFonts w:ascii="Times New Roman" w:eastAsia="Times New Roman" w:hAnsi="Times New Roman"/>
@@ -16055,7 +16055,7 @@
           <w:noProof/>
         </w:rPr>
         <w:drawing>
-          <wp:inline distT="0" distB="0" distL="0" distR="0" wp14:anchorId="63FC8220" wp14:editId="6918FD35">
+          <wp:inline distT="0" distB="0" distL="0" distR="0" wp14:anchorId="5DF52A07" wp14:editId="215A4229">
             <wp:extent cx="5577840" cy="3718560"/>
             <wp:effectExtent l="0" t="0" r="0" b="0"/>
             <wp:docPr id="6" name="Picture 6" descr="Hình 2.4. Biểu đồ tuần tự đăng ký và đăng nhập" title="Hình 2.4. Biểu đồ tuần tự đăng ký và đăng nhập"/>
@@ -16095,7 +16095,7 @@
       <w:pPr>
         <w:pStyle w:val="FigureCaption"/>
       </w:pPr>
-      <w:bookmarkStart w:id="48" w:name="_Toc232196005"/>
+      <w:bookmarkStart w:id="48" w:name="_Toc232196151"/>
       <w:r>
         <w:t>Hình 2.4. Biểu đồ tuần tự đăng ký và đăng nhập</w:t>
       </w:r>
@@ -16105,7 +16105,7 @@
       <w:pPr>
         <w:pStyle w:val="Heading3"/>
       </w:pPr>
-      <w:bookmarkStart w:id="49" w:name="_Toc232195966"/>
+      <w:bookmarkStart w:id="49" w:name="_Toc232196112"/>
       <w:r>
         <w:rPr>
           <w:rFonts w:ascii="Times New Roman" w:eastAsia="Times New Roman" w:hAnsi="Times New Roman"/>
@@ -16134,7 +16134,7 @@
           <w:noProof/>
         </w:rPr>
         <w:drawing>
-          <wp:inline distT="0" distB="0" distL="0" distR="0" wp14:anchorId="7EB6D68E" wp14:editId="475212E7">
+          <wp:inline distT="0" distB="0" distL="0" distR="0" wp14:anchorId="1EA8DCCA" wp14:editId="4F2AE635">
             <wp:extent cx="5577840" cy="3718560"/>
             <wp:effectExtent l="0" t="0" r="0" b="0"/>
             <wp:docPr id="7" name="Picture 7" descr="Hình 2.5. Biểu đồ tuần tự đăng bài và trả lời" title="Hình 2.5. Biểu đồ tuần tự đăng bài và trả lời"/>
@@ -16174,7 +16174,7 @@
       <w:pPr>
         <w:pStyle w:val="FigureCaption"/>
       </w:pPr>
-      <w:bookmarkStart w:id="50" w:name="_Toc232196006"/>
+      <w:bookmarkStart w:id="50" w:name="_Toc232196152"/>
       <w:r>
         <w:t>Hình 2.5. Biểu đồ tuần tự đăng bài và trả lời</w:t>
       </w:r>
@@ -16184,7 +16184,7 @@
       <w:pPr>
         <w:pStyle w:val="Heading3"/>
       </w:pPr>
-      <w:bookmarkStart w:id="51" w:name="_Toc232195967"/>
+      <w:bookmarkStart w:id="51" w:name="_Toc232196113"/>
       <w:r>
         <w:rPr>
           <w:rFonts w:ascii="Times New Roman" w:eastAsia="Times New Roman" w:hAnsi="Times New Roman"/>
@@ -16213,7 +16213,7 @@
           <w:noProof/>
         </w:rPr>
         <w:drawing>
-          <wp:inline distT="0" distB="0" distL="0" distR="0" wp14:anchorId="32ABF193" wp14:editId="095F5D16">
+          <wp:inline distT="0" distB="0" distL="0" distR="0" wp14:anchorId="3BCE5B44" wp14:editId="76901BA3">
             <wp:extent cx="5577840" cy="3718560"/>
             <wp:effectExtent l="0" t="0" r="0" b="0"/>
             <wp:docPr id="8" name="Picture 8" descr="Hình 2.6. Biểu đồ tuần tự tương tác chatbot" title="Hình 2.6. Biểu đồ tuần tự tương tác chatbot"/>
@@ -16253,7 +16253,7 @@
       <w:pPr>
         <w:pStyle w:val="FigureCaption"/>
       </w:pPr>
-      <w:bookmarkStart w:id="52" w:name="_Toc232196007"/>
+      <w:bookmarkStart w:id="52" w:name="_Toc232196153"/>
       <w:r>
         <w:t>Hình 2.6. Biểu đồ tuần tự tương tác chatbot</w:t>
       </w:r>
@@ -16263,7 +16263,7 @@
       <w:pPr>
         <w:pStyle w:val="Heading3"/>
       </w:pPr>
-      <w:bookmarkStart w:id="53" w:name="_Toc232195968"/>
+      <w:bookmarkStart w:id="53" w:name="_Toc232196114"/>
       <w:r>
         <w:rPr>
           <w:rFonts w:ascii="Times New Roman" w:eastAsia="Times New Roman" w:hAnsi="Times New Roman"/>
@@ -16292,7 +16292,7 @@
           <w:noProof/>
         </w:rPr>
         <w:drawing>
-          <wp:inline distT="0" distB="0" distL="0" distR="0" wp14:anchorId="2A82CFD0" wp14:editId="776B2897">
+          <wp:inline distT="0" distB="0" distL="0" distR="0" wp14:anchorId="1181378D" wp14:editId="253CCF1A">
             <wp:extent cx="5577840" cy="3718560"/>
             <wp:effectExtent l="0" t="0" r="0" b="0"/>
             <wp:docPr id="9" name="Picture 9" descr="Hình 2.7. Biểu đồ tuần tự gửi biểu mẫu liên hệ" title="Hình 2.7. Biểu đồ tuần tự gửi biểu mẫu liên hệ"/>
@@ -16332,7 +16332,7 @@
       <w:pPr>
         <w:pStyle w:val="FigureCaption"/>
       </w:pPr>
-      <w:bookmarkStart w:id="54" w:name="_Toc232196008"/>
+      <w:bookmarkStart w:id="54" w:name="_Toc232196154"/>
       <w:r>
         <w:t>Hình 2.7. Biểu đồ tuần tự gửi biểu mẫu liên hệ</w:t>
       </w:r>
@@ -16342,7 +16342,7 @@
       <w:pPr>
         <w:pStyle w:val="Heading2"/>
       </w:pPr>
-      <w:bookmarkStart w:id="55" w:name="_Toc232195969"/>
+      <w:bookmarkStart w:id="55" w:name="_Toc232196115"/>
       <w:r>
         <w:rPr>
           <w:rFonts w:ascii="Times New Roman" w:eastAsia="Times New Roman" w:hAnsi="Times New Roman"/>
@@ -16355,7 +16355,7 @@
       <w:pPr>
         <w:pStyle w:val="Heading3"/>
       </w:pPr>
-      <w:bookmarkStart w:id="56" w:name="_Toc232195970"/>
+      <w:bookmarkStart w:id="56" w:name="_Toc232196116"/>
       <w:r>
         <w:rPr>
           <w:rFonts w:ascii="Times New Roman" w:eastAsia="Times New Roman" w:hAnsi="Times New Roman"/>
@@ -16384,7 +16384,7 @@
           <w:noProof/>
         </w:rPr>
         <w:drawing>
-          <wp:inline distT="0" distB="0" distL="0" distR="0" wp14:anchorId="65011460" wp14:editId="757799E3">
+          <wp:inline distT="0" distB="0" distL="0" distR="0" wp14:anchorId="28E1D8BC" wp14:editId="7B44784A">
             <wp:extent cx="5577840" cy="3137535"/>
             <wp:effectExtent l="0" t="0" r="0" b="0"/>
             <wp:docPr id="10" name="Picture 10" descr="Hình 2.8. Giao diện trang chủ mô phỏng Hệ Mặt Trời" title="Hình 2.8. Giao diện trang chủ mô phỏng Hệ Mặt Trời"/>
@@ -16424,7 +16424,7 @@
       <w:pPr>
         <w:pStyle w:val="FigureCaption"/>
       </w:pPr>
-      <w:bookmarkStart w:id="57" w:name="_Toc232196009"/>
+      <w:bookmarkStart w:id="57" w:name="_Toc232196155"/>
       <w:r>
         <w:t>Hình 2.8. Giao diện trang chủ mô phỏng Hệ Mặt Trời</w:t>
       </w:r>
@@ -16434,7 +16434,7 @@
       <w:pPr>
         <w:pStyle w:val="Heading3"/>
       </w:pPr>
-      <w:bookmarkStart w:id="58" w:name="_Toc232195971"/>
+      <w:bookmarkStart w:id="58" w:name="_Toc232196117"/>
       <w:r>
         <w:rPr>
           <w:rFonts w:ascii="Times New Roman" w:eastAsia="Times New Roman" w:hAnsi="Times New Roman"/>
@@ -16463,7 +16463,7 @@
           <w:noProof/>
         </w:rPr>
         <w:drawing>
-          <wp:inline distT="0" distB="0" distL="0" distR="0" wp14:anchorId="085792B4" wp14:editId="22A3B2F9">
+          <wp:inline distT="0" distB="0" distL="0" distR="0" wp14:anchorId="0CC7A07A" wp14:editId="616429E1">
             <wp:extent cx="5577840" cy="3177251"/>
             <wp:effectExtent l="0" t="0" r="0" b="0"/>
             <wp:docPr id="11" name="Picture 11" descr="Hình 2.9. Giao diện trang hành tinh Trái Đất" title="Hình 2.9. Giao diện trang hành tinh Trái Đất"/>
@@ -16503,7 +16503,7 @@
       <w:pPr>
         <w:pStyle w:val="FigureCaption"/>
       </w:pPr>
-      <w:bookmarkStart w:id="59" w:name="_Toc232196010"/>
+      <w:bookmarkStart w:id="59" w:name="_Toc232196156"/>
       <w:r>
         <w:t>Hình 2.9. Giao diện trang hành tinh Trái Đất</w:t>
       </w:r>
@@ -16513,7 +16513,7 @@
       <w:pPr>
         <w:pStyle w:val="Heading3"/>
       </w:pPr>
-      <w:bookmarkStart w:id="60" w:name="_Toc232195972"/>
+      <w:bookmarkStart w:id="60" w:name="_Toc232196118"/>
       <w:r>
         <w:rPr>
           <w:rFonts w:ascii="Times New Roman" w:eastAsia="Times New Roman" w:hAnsi="Times New Roman"/>
@@ -16542,7 +16542,7 @@
           <w:noProof/>
         </w:rPr>
         <w:drawing>
-          <wp:inline distT="0" distB="0" distL="0" distR="0" wp14:anchorId="7D15BB0B" wp14:editId="45B584DD">
+          <wp:inline distT="0" distB="0" distL="0" distR="0" wp14:anchorId="5AA79A77" wp14:editId="6ADDBF7D">
             <wp:extent cx="5577840" cy="3177251"/>
             <wp:effectExtent l="0" t="0" r="0" b="0"/>
             <wp:docPr id="12" name="Picture 12" descr="Hình 2.10. Giao diện bài thực hành tiếp đất trên trang Trái Đất" title="Hình 2.10. Giao diện bài thực hành tiếp đất trên trang Trái Đất"/>
@@ -16583,7 +16583,7 @@
         <w:pStyle w:val="FigureCaption"/>
         <w:keepNext/>
       </w:pPr>
-      <w:bookmarkStart w:id="61" w:name="_Toc232196011"/>
+      <w:bookmarkStart w:id="61" w:name="_Toc232196157"/>
       <w:r>
         <w:t>Hình 2.10. Giao diện bài thực hành tiếp đất trên trang Trái Đất</w:t>
       </w:r>
@@ -16601,7 +16601,7 @@
           <w:noProof/>
         </w:rPr>
         <w:drawing>
-          <wp:inline distT="0" distB="0" distL="0" distR="0" wp14:anchorId="5FB6F377" wp14:editId="08A70CA0">
+          <wp:inline distT="0" distB="0" distL="0" distR="0" wp14:anchorId="58080CB4" wp14:editId="47DC3D9E">
             <wp:extent cx="5577840" cy="3177251"/>
             <wp:effectExtent l="0" t="0" r="0" b="0"/>
             <wp:docPr id="13" name="Picture 13" descr="Hình 2.11. Giao diện trạm tín hiệu cảm xúc" title="Hình 2.11. Giao diện trạm tín hiệu cảm xúc"/>
@@ -16641,7 +16641,7 @@
       <w:pPr>
         <w:pStyle w:val="FigureCaption"/>
       </w:pPr>
-      <w:bookmarkStart w:id="62" w:name="_Toc232196012"/>
+      <w:bookmarkStart w:id="62" w:name="_Toc232196158"/>
       <w:r>
         <w:t>Hình 2.11. Giao diện trạm tín hiệu cảm xúc</w:t>
       </w:r>
@@ -16651,7 +16651,7 @@
       <w:pPr>
         <w:pStyle w:val="Heading3"/>
       </w:pPr>
-      <w:bookmarkStart w:id="63" w:name="_Toc232195973"/>
+      <w:bookmarkStart w:id="63" w:name="_Toc232196119"/>
       <w:r>
         <w:rPr>
           <w:rFonts w:ascii="Times New Roman" w:eastAsia="Times New Roman" w:hAnsi="Times New Roman"/>
@@ -16680,7 +16680,7 @@
           <w:noProof/>
         </w:rPr>
         <w:drawing>
-          <wp:inline distT="0" distB="0" distL="0" distR="0" wp14:anchorId="0B9C1B4A" wp14:editId="7ECF8C18">
+          <wp:inline distT="0" distB="0" distL="0" distR="0" wp14:anchorId="6734A346" wp14:editId="69689C34">
             <wp:extent cx="5577840" cy="3137535"/>
             <wp:effectExtent l="0" t="0" r="0" b="0"/>
             <wp:docPr id="14" name="Picture 14" descr="Hình 2.12. Giao diện trang cộng đồng" title="Hình 2.12. Giao diện trang cộng đồng"/>
@@ -16721,7 +16721,7 @@
         <w:pStyle w:val="FigureCaption"/>
         <w:keepNext/>
       </w:pPr>
-      <w:bookmarkStart w:id="64" w:name="_Toc232196013"/>
+      <w:bookmarkStart w:id="64" w:name="_Toc232196159"/>
       <w:r>
         <w:t>Hình 2.12. Giao diện trang cộng đồng</w:t>
       </w:r>
@@ -16739,7 +16739,7 @@
           <w:noProof/>
         </w:rPr>
         <w:drawing>
-          <wp:inline distT="0" distB="0" distL="0" distR="0" wp14:anchorId="7B3E66FB" wp14:editId="2401AB8A">
+          <wp:inline distT="0" distB="0" distL="0" distR="0" wp14:anchorId="6D3D66AE" wp14:editId="679921B6">
             <wp:extent cx="5577840" cy="3137535"/>
             <wp:effectExtent l="0" t="0" r="0" b="0"/>
             <wp:docPr id="15" name="Picture 15" descr="Hình 2.13. Giao diện đăng nhập và đăng ký có email" title="Hình 2.13. Giao diện đăng nhập và đăng ký có email"/>
@@ -16779,7 +16779,7 @@
       <w:pPr>
         <w:pStyle w:val="FigureCaption"/>
       </w:pPr>
-      <w:bookmarkStart w:id="65" w:name="_Toc232196014"/>
+      <w:bookmarkStart w:id="65" w:name="_Toc232196160"/>
       <w:r>
         <w:t>Hình 2.13. Giao diện đăng nhập và đăng ký có email</w:t>
       </w:r>
@@ -16789,7 +16789,7 @@
       <w:pPr>
         <w:pStyle w:val="Heading3"/>
       </w:pPr>
-      <w:bookmarkStart w:id="66" w:name="_Toc232195974"/>
+      <w:bookmarkStart w:id="66" w:name="_Toc232196120"/>
       <w:r>
         <w:rPr>
           <w:rFonts w:ascii="Times New Roman" w:eastAsia="Times New Roman" w:hAnsi="Times New Roman"/>
@@ -16818,7 +16818,7 @@
           <w:noProof/>
         </w:rPr>
         <w:drawing>
-          <wp:inline distT="0" distB="0" distL="0" distR="0" wp14:anchorId="6F1E8673" wp14:editId="0118E843">
+          <wp:inline distT="0" distB="0" distL="0" distR="0" wp14:anchorId="78AF30BC" wp14:editId="73ED9288">
             <wp:extent cx="5577840" cy="3137535"/>
             <wp:effectExtent l="0" t="0" r="0" b="0"/>
             <wp:docPr id="16" name="Picture 16" descr="Hình 2.14. Cửa sổ Trợ lý Tinh hà trên trang chủ" title="Hình 2.14. Cửa sổ Trợ lý Tinh hà trên trang chủ"/>
@@ -16858,7 +16858,7 @@
       <w:pPr>
         <w:pStyle w:val="FigureCaption"/>
       </w:pPr>
-      <w:bookmarkStart w:id="67" w:name="_Toc232196015"/>
+      <w:bookmarkStart w:id="67" w:name="_Toc232196161"/>
       <w:r>
         <w:t>Hình 2.14. Cửa sổ Trợ lý Tinh hà trên trang chủ</w:t>
       </w:r>
@@ -16868,7 +16868,7 @@
       <w:pPr>
         <w:pStyle w:val="Heading3"/>
       </w:pPr>
-      <w:bookmarkStart w:id="68" w:name="_Toc232195975"/>
+      <w:bookmarkStart w:id="68" w:name="_Toc232196121"/>
       <w:r>
         <w:rPr>
           <w:rFonts w:ascii="Times New Roman" w:eastAsia="Times New Roman" w:hAnsi="Times New Roman"/>
@@ -16897,7 +16897,7 @@
           <w:noProof/>
         </w:rPr>
         <w:drawing>
-          <wp:inline distT="0" distB="0" distL="0" distR="0" wp14:anchorId="3392F6D5" wp14:editId="28140E77">
+          <wp:inline distT="0" distB="0" distL="0" distR="0" wp14:anchorId="7C1B5D85" wp14:editId="40DFA9BB">
             <wp:extent cx="5577840" cy="3152312"/>
             <wp:effectExtent l="0" t="0" r="0" b="0"/>
             <wp:docPr id="17" name="Picture 17" descr="Hình 2.15. Giao diện trang liên hệ" title="Hình 2.15. Giao diện trang liên hệ"/>
@@ -16937,7 +16937,7 @@
       <w:pPr>
         <w:pStyle w:val="FigureCaption"/>
       </w:pPr>
-      <w:bookmarkStart w:id="69" w:name="_Toc232196016"/>
+      <w:bookmarkStart w:id="69" w:name="_Toc232196162"/>
       <w:r>
         <w:t>Hình 2.15. Giao diện trang liên hệ</w:t>
       </w:r>
@@ -16947,7 +16947,7 @@
       <w:pPr>
         <w:pStyle w:val="Heading2"/>
       </w:pPr>
-      <w:bookmarkStart w:id="70" w:name="_Toc232195976"/>
+      <w:bookmarkStart w:id="70" w:name="_Toc232196122"/>
       <w:r>
         <w:rPr>
           <w:rFonts w:ascii="Times New Roman" w:eastAsia="Times New Roman" w:hAnsi="Times New Roman"/>
@@ -16970,7 +16970,7 @@
       <w:pPr>
         <w:pStyle w:val="Heading1"/>
       </w:pPr>
-      <w:bookmarkStart w:id="71" w:name="_Toc232195977"/>
+      <w:bookmarkStart w:id="71" w:name="_Toc232196123"/>
       <w:r>
         <w:rPr>
           <w:rFonts w:ascii="Times New Roman" w:eastAsia="Times New Roman" w:hAnsi="Times New Roman"/>
@@ -16983,7 +16983,7 @@
       <w:pPr>
         <w:pStyle w:val="Heading2"/>
       </w:pPr>
-      <w:bookmarkStart w:id="72" w:name="_Toc232195978"/>
+      <w:bookmarkStart w:id="72" w:name="_Toc232196124"/>
       <w:r>
         <w:rPr>
           <w:rFonts w:ascii="Times New Roman" w:eastAsia="Times New Roman" w:hAnsi="Times New Roman"/>
@@ -16997,7 +16997,7 @@
         <w:pStyle w:val="TableCaption"/>
         <w:keepNext/>
       </w:pPr>
-      <w:bookmarkStart w:id="73" w:name="_Toc232196029"/>
+      <w:bookmarkStart w:id="73" w:name="_Toc232196175"/>
       <w:r>
         <w:t>Bảng 3.1. Môi trường và công cụ phát triển</w:t>
       </w:r>
@@ -17340,7 +17340,7 @@
       <w:pPr>
         <w:pStyle w:val="Heading2"/>
       </w:pPr>
-      <w:bookmarkStart w:id="74" w:name="_Toc232195979"/>
+      <w:bookmarkStart w:id="74" w:name="_Toc232196125"/>
       <w:r>
         <w:rPr>
           <w:rFonts w:ascii="Times New Roman" w:eastAsia="Times New Roman" w:hAnsi="Times New Roman"/>
@@ -17369,7 +17369,7 @@
           <w:noProof/>
         </w:rPr>
         <w:drawing>
-          <wp:inline distT="0" distB="0" distL="0" distR="0" wp14:anchorId="247BBC58" wp14:editId="39F53447">
+          <wp:inline distT="0" distB="0" distL="0" distR="0" wp14:anchorId="5F7F52DC" wp14:editId="329A994A">
             <wp:extent cx="5577840" cy="3408680"/>
             <wp:effectExtent l="0" t="0" r="0" b="0"/>
             <wp:docPr id="18" name="Picture 18" descr="Hình 3.1. Cấu trúc thư mục chính của dự án" title="Hình 3.1. Cấu trúc thư mục chính của dự án"/>
@@ -17409,7 +17409,7 @@
       <w:pPr>
         <w:pStyle w:val="FigureCaption"/>
       </w:pPr>
-      <w:bookmarkStart w:id="75" w:name="_Toc232196017"/>
+      <w:bookmarkStart w:id="75" w:name="_Toc232196163"/>
       <w:r>
         <w:t>Hình 3.1. Cấu trúc thư mục chính của dự án</w:t>
       </w:r>
@@ -17424,7 +17424,7 @@
       <w:pPr>
         <w:pStyle w:val="Heading2"/>
       </w:pPr>
-      <w:bookmarkStart w:id="76" w:name="_Toc232195980"/>
+      <w:bookmarkStart w:id="76" w:name="_Toc232196126"/>
       <w:r>
         <w:rPr>
           <w:rFonts w:ascii="Times New Roman" w:eastAsia="Times New Roman" w:hAnsi="Times New Roman"/>
@@ -17452,7 +17452,7 @@
       <w:pPr>
         <w:pStyle w:val="Heading2"/>
       </w:pPr>
-      <w:bookmarkStart w:id="77" w:name="_Toc232195981"/>
+      <w:bookmarkStart w:id="77" w:name="_Toc232196127"/>
       <w:r>
         <w:rPr>
           <w:rFonts w:ascii="Times New Roman" w:eastAsia="Times New Roman" w:hAnsi="Times New Roman"/>
@@ -17475,7 +17475,7 @@
       <w:pPr>
         <w:pStyle w:val="Heading2"/>
       </w:pPr>
-      <w:bookmarkStart w:id="78" w:name="_Toc232195982"/>
+      <w:bookmarkStart w:id="78" w:name="_Toc232196128"/>
       <w:r>
         <w:rPr>
           <w:rFonts w:ascii="Times New Roman" w:eastAsia="Times New Roman" w:hAnsi="Times New Roman"/>
@@ -17498,7 +17498,7 @@
       <w:pPr>
         <w:pStyle w:val="Heading2"/>
       </w:pPr>
-      <w:bookmarkStart w:id="79" w:name="_Toc232195983"/>
+      <w:bookmarkStart w:id="79" w:name="_Toc232196129"/>
       <w:r>
         <w:rPr>
           <w:rFonts w:ascii="Times New Roman" w:eastAsia="Times New Roman" w:hAnsi="Times New Roman"/>
@@ -17521,7 +17521,7 @@
       <w:pPr>
         <w:pStyle w:val="Heading2"/>
       </w:pPr>
-      <w:bookmarkStart w:id="80" w:name="_Toc232195984"/>
+      <w:bookmarkStart w:id="80" w:name="_Toc232196130"/>
       <w:r>
         <w:rPr>
           <w:rFonts w:ascii="Times New Roman" w:eastAsia="Times New Roman" w:hAnsi="Times New Roman"/>
@@ -17544,7 +17544,7 @@
       <w:pPr>
         <w:pStyle w:val="Heading2"/>
       </w:pPr>
-      <w:bookmarkStart w:id="81" w:name="_Toc232195985"/>
+      <w:bookmarkStart w:id="81" w:name="_Toc232196131"/>
       <w:r>
         <w:rPr>
           <w:rFonts w:ascii="Times New Roman" w:eastAsia="Times New Roman" w:hAnsi="Times New Roman"/>
@@ -17627,7 +17627,7 @@
       <w:pPr>
         <w:pStyle w:val="Heading2"/>
       </w:pPr>
-      <w:bookmarkStart w:id="82" w:name="_Toc232195986"/>
+      <w:bookmarkStart w:id="82" w:name="_Toc232196132"/>
       <w:r>
         <w:rPr>
           <w:rFonts w:ascii="Times New Roman" w:eastAsia="Times New Roman" w:hAnsi="Times New Roman"/>
@@ -17641,7 +17641,7 @@
         <w:pStyle w:val="TableCaption"/>
         <w:keepNext/>
       </w:pPr>
-      <w:bookmarkStart w:id="83" w:name="_Toc232196030"/>
+      <w:bookmarkStart w:id="83" w:name="_Toc232196176"/>
       <w:r>
         <w:t>Bảng 3.2. Danh sách REST API</w:t>
       </w:r>
@@ -18585,7 +18585,7 @@
       <w:pPr>
         <w:pStyle w:val="Heading2"/>
       </w:pPr>
-      <w:bookmarkStart w:id="84" w:name="_Toc232195987"/>
+      <w:bookmarkStart w:id="84" w:name="_Toc232196133"/>
       <w:r>
         <w:rPr>
           <w:rFonts w:ascii="Times New Roman" w:eastAsia="Times New Roman" w:hAnsi="Times New Roman"/>
@@ -18608,7 +18608,7 @@
       <w:pPr>
         <w:pStyle w:val="Heading2"/>
       </w:pPr>
-      <w:bookmarkStart w:id="85" w:name="_Toc232195988"/>
+      <w:bookmarkStart w:id="85" w:name="_Toc232196134"/>
       <w:r>
         <w:rPr>
           <w:rFonts w:ascii="Times New Roman" w:eastAsia="Times New Roman" w:hAnsi="Times New Roman"/>
@@ -18627,7 +18627,7 @@
         <w:pStyle w:val="TableCaption"/>
         <w:keepNext/>
       </w:pPr>
-      <w:bookmarkStart w:id="86" w:name="_Toc232196031"/>
+      <w:bookmarkStart w:id="86" w:name="_Toc232196177"/>
       <w:r>
         <w:t>Bảng 3.3. Kịch bản kiểm thử và trạng thái xác minh</w:t>
       </w:r>
@@ -19882,7 +19882,7 @@
       <w:pPr>
         <w:pStyle w:val="Heading2"/>
       </w:pPr>
-      <w:bookmarkStart w:id="87" w:name="_Toc232195989"/>
+      <w:bookmarkStart w:id="87" w:name="_Toc232196135"/>
       <w:r>
         <w:rPr>
           <w:rFonts w:ascii="Times New Roman" w:eastAsia="Times New Roman" w:hAnsi="Times New Roman"/>
@@ -19896,7 +19896,7 @@
         <w:pStyle w:val="TableCaption"/>
         <w:keepNext/>
       </w:pPr>
-      <w:bookmarkStart w:id="88" w:name="_Toc232196032"/>
+      <w:bookmarkStart w:id="88" w:name="_Toc232196178"/>
       <w:r>
         <w:t>Bảng 3.4. Mức độ hoàn thành các nhóm chức năng</w:t>
       </w:r>
@@ -20244,7 +20244,7 @@
       <w:pPr>
         <w:pStyle w:val="Heading2"/>
       </w:pPr>
-      <w:bookmarkStart w:id="89" w:name="_Toc232195990"/>
+      <w:bookmarkStart w:id="89" w:name="_Toc232196136"/>
       <w:r>
         <w:rPr>
           <w:rFonts w:ascii="Times New Roman" w:eastAsia="Times New Roman" w:hAnsi="Times New Roman"/>
@@ -20329,7 +20329,7 @@
       <w:pPr>
         <w:pStyle w:val="Heading2"/>
       </w:pPr>
-      <w:bookmarkStart w:id="90" w:name="_Toc232195991"/>
+      <w:bookmarkStart w:id="90" w:name="_Toc232196137"/>
       <w:r>
         <w:rPr>
           <w:rFonts w:ascii="Times New Roman" w:eastAsia="Times New Roman" w:hAnsi="Times New Roman"/>
@@ -20352,7 +20352,7 @@
       <w:pPr>
         <w:pStyle w:val="Heading1"/>
       </w:pPr>
-      <w:bookmarkStart w:id="91" w:name="_Toc232195992"/>
+      <w:bookmarkStart w:id="91" w:name="_Toc232196138"/>
       <w:r>
         <w:rPr>
           <w:rFonts w:ascii="Times New Roman" w:eastAsia="Times New Roman" w:hAnsi="Times New Roman"/>
@@ -20365,7 +20365,7 @@
       <w:pPr>
         <w:pStyle w:val="Heading2"/>
       </w:pPr>
-      <w:bookmarkStart w:id="92" w:name="_Toc232195993"/>
+      <w:bookmarkStart w:id="92" w:name="_Toc232196139"/>
       <w:r>
         <w:rPr>
           <w:rFonts w:ascii="Times New Roman" w:eastAsia="Times New Roman" w:hAnsi="Times New Roman"/>
@@ -20388,7 +20388,7 @@
       <w:pPr>
         <w:pStyle w:val="Heading2"/>
       </w:pPr>
-      <w:bookmarkStart w:id="93" w:name="_Toc232195994"/>
+      <w:bookmarkStart w:id="93" w:name="_Toc232196140"/>
       <w:r>
         <w:rPr>
           <w:rFonts w:ascii="Times New Roman" w:eastAsia="Times New Roman" w:hAnsi="Times New Roman"/>
@@ -20406,7 +20406,7 @@
       <w:pPr>
         <w:pStyle w:val="Heading2"/>
       </w:pPr>
-      <w:bookmarkStart w:id="94" w:name="_Toc232195995"/>
+      <w:bookmarkStart w:id="94" w:name="_Toc232196141"/>
       <w:r>
         <w:rPr>
           <w:rFonts w:ascii="Times New Roman" w:eastAsia="Times New Roman" w:hAnsi="Times New Roman"/>
@@ -20504,7 +20504,7 @@
       <w:pPr>
         <w:pStyle w:val="Heading1"/>
       </w:pPr>
-      <w:bookmarkStart w:id="95" w:name="_Toc232195996"/>
+      <w:bookmarkStart w:id="95" w:name="_Toc232196142"/>
       <w:r>
         <w:rPr>
           <w:rFonts w:ascii="Times New Roman" w:eastAsia="Times New Roman" w:hAnsi="Times New Roman"/>
@@ -20698,7 +20698,7 @@
       <w:pPr>
         <w:pStyle w:val="Heading1"/>
       </w:pPr>
-      <w:bookmarkStart w:id="96" w:name="_Toc232195997"/>
+      <w:bookmarkStart w:id="96" w:name="_Toc232196143"/>
       <w:r>
         <w:rPr>
           <w:rFonts w:ascii="Times New Roman" w:eastAsia="Times New Roman" w:hAnsi="Times New Roman"/>
@@ -20711,7 +20711,7 @@
       <w:pPr>
         <w:pStyle w:val="Heading2"/>
       </w:pPr>
-      <w:bookmarkStart w:id="97" w:name="_Toc232195998"/>
+      <w:bookmarkStart w:id="97" w:name="_Toc232196144"/>
       <w:r>
         <w:rPr>
           <w:rFonts w:ascii="Times New Roman" w:eastAsia="Times New Roman" w:hAnsi="Times New Roman"/>
@@ -20807,7 +20807,7 @@
       <w:pPr>
         <w:pStyle w:val="Heading2"/>
       </w:pPr>
-      <w:bookmarkStart w:id="98" w:name="_Toc232195999"/>
+      <w:bookmarkStart w:id="98" w:name="_Toc232196145"/>
       <w:r>
         <w:rPr>
           <w:rFonts w:ascii="Times New Roman" w:eastAsia="Times New Roman" w:hAnsi="Times New Roman"/>
@@ -20868,7 +20868,7 @@
       <w:pPr>
         <w:pStyle w:val="Heading2"/>
       </w:pPr>
-      <w:bookmarkStart w:id="99" w:name="_Toc232196000"/>
+      <w:bookmarkStart w:id="99" w:name="_Toc232196146"/>
       <w:r>
         <w:rPr>
           <w:rFonts w:ascii="Times New Roman" w:eastAsia="Times New Roman" w:hAnsi="Times New Roman"/>
@@ -21022,7 +21022,7 @@
       <w:pPr>
         <w:pStyle w:val="Heading2"/>
       </w:pPr>
-      <w:bookmarkStart w:id="100" w:name="_Toc232196001"/>
+      <w:bookmarkStart w:id="100" w:name="_Toc232196147"/>
       <w:r>
         <w:rPr>
           <w:rFonts w:ascii="Times New Roman" w:eastAsia="Times New Roman" w:hAnsi="Times New Roman"/>
@@ -21445,31 +21445,31 @@
       </w:rPr>
     </w:lvl>
   </w:abstractNum>
-  <w:num w:numId="1" w16cid:durableId="8601980">
+  <w:num w:numId="1" w16cid:durableId="1293829768">
     <w:abstractNumId w:val="8"/>
   </w:num>
-  <w:num w:numId="2" w16cid:durableId="264651619">
+  <w:num w:numId="2" w16cid:durableId="1143615951">
     <w:abstractNumId w:val="6"/>
   </w:num>
-  <w:num w:numId="3" w16cid:durableId="987512053">
+  <w:num w:numId="3" w16cid:durableId="1389963311">
     <w:abstractNumId w:val="5"/>
   </w:num>
-  <w:num w:numId="4" w16cid:durableId="551304943">
+  <w:num w:numId="4" w16cid:durableId="1844011558">
     <w:abstractNumId w:val="4"/>
   </w:num>
-  <w:num w:numId="5" w16cid:durableId="1063065270">
+  <w:num w:numId="5" w16cid:durableId="1890726584">
     <w:abstractNumId w:val="7"/>
   </w:num>
-  <w:num w:numId="6" w16cid:durableId="1864786340">
+  <w:num w:numId="6" w16cid:durableId="277302141">
     <w:abstractNumId w:val="3"/>
   </w:num>
-  <w:num w:numId="7" w16cid:durableId="1438598538">
+  <w:num w:numId="7" w16cid:durableId="30694224">
     <w:abstractNumId w:val="2"/>
   </w:num>
-  <w:num w:numId="8" w16cid:durableId="2120248132">
+  <w:num w:numId="8" w16cid:durableId="1214731804">
     <w:abstractNumId w:val="1"/>
   </w:num>
-  <w:num w:numId="9" w16cid:durableId="58526869">
+  <w:num w:numId="9" w16cid:durableId="960578562">
     <w:abstractNumId w:val="0"/>
   </w:num>
 </w:numbering>
@@ -32904,7 +32904,7 @@
     <w:autoRedefine/>
     <w:uiPriority w:val="39"/>
     <w:unhideWhenUsed/>
-    <w:rsid w:val="00F2571D"/>
+    <w:rsid w:val="001B728C"/>
   </w:style>
   <w:style w:type="paragraph" w:styleId="TOC2">
     <w:name w:val="toc 2"/>
@@ -32913,7 +32913,7 @@
     <w:autoRedefine/>
     <w:uiPriority w:val="39"/>
     <w:unhideWhenUsed/>
-    <w:rsid w:val="00F2571D"/>
+    <w:rsid w:val="001B728C"/>
     <w:pPr>
       <w:ind w:left="260"/>
     </w:pPr>
@@ -32925,7 +32925,7 @@
     <w:autoRedefine/>
     <w:uiPriority w:val="39"/>
     <w:unhideWhenUsed/>
-    <w:rsid w:val="00F2571D"/>
+    <w:rsid w:val="001B728C"/>
     <w:pPr>
       <w:ind w:left="520"/>
     </w:pPr>
@@ -32935,7 +32935,7 @@
     <w:basedOn w:val="DefaultParagraphFont"/>
     <w:uiPriority w:val="99"/>
     <w:unhideWhenUsed/>
-    <w:rsid w:val="00F2571D"/>
+    <w:rsid w:val="001B728C"/>
     <w:rPr>
       <w:color w:val="0000FF" w:themeColor="hyperlink"/>
       <w:u w:val="single"/>

</xml_diff>